<commit_message>
Document GitHub sync & deployment process (Part 11)
Add Part 11 to the design doc covering the repo, GitHub Pages,
setup steps, and the edit/commit/push update workflow.
Regenerate docx and pdf. Add .gitignore to keep stray files out.

Co-Authored-By: Claude Opus 4.8 <noreply@anthropic.com>
</commit_message>
<xml_diff>
--- a/Agent_Factory_Tycoon_Concept.docx
+++ b/Agent_Factory_Tycoon_Concept.docx
@@ -18026,12 +18026,799 @@
     </w:p>
     <w:bookmarkEnd w:id="125"/>
     <w:bookmarkEnd w:id="126"/>
-    <w:bookmarkStart w:id="133" w:name="sources"/>
+    <w:bookmarkStart w:id="131" w:name="part-11-github-sync-deployment"/>
     <w:p>
       <w:pPr>
         <w:pStyle w:val="Heading1"/>
       </w:pPr>
       <w:r>
+        <w:t xml:space="preserve">Part 11 — GitHub Sync &amp; Deployment</w:t>
+      </w:r>
+    </w:p>
+    <w:p>
+      <w:pPr>
+        <w:pStyle w:val="FirstParagraph"/>
+      </w:pPr>
+      <w:r>
+        <w:t xml:space="preserve">The playable prototype and this design document are version-controlled on GitHub and published as a live, in-browser game via GitHub Pages.</w:t>
+      </w:r>
+    </w:p>
+    <w:bookmarkStart w:id="127" w:name="live-links"/>
+    <w:p>
+      <w:pPr>
+        <w:pStyle w:val="Heading2"/>
+      </w:pPr>
+      <w:r>
+        <w:t xml:space="preserve">Live Links</w:t>
+      </w:r>
+    </w:p>
+    <w:tbl>
+      <w:tblPr>
+        <w:tblStyle w:val="Table"/>
+        <w:tblW w:type="pct" w:w="5000"/>
+        <w:tblLayout w:type="fixed"/>
+        <w:tblLook w:firstRow="1" w:lastRow="0" w:firstColumn="0" w:lastColumn="0" w:noHBand="0" w:noVBand="0" w:val="0020"/>
+      </w:tblPr>
+      <w:tblGrid>
+        <w:gridCol w:w="5280"/>
+        <w:gridCol w:w="2640"/>
+      </w:tblGrid>
+      <w:tr>
+        <w:trPr>
+          <w:tblHeader w:val="on"/>
+        </w:trPr>
+        <w:tc>
+          <w:tcPr/>
+          <w:p>
+            <w:pPr>
+              <w:pStyle w:val="Compact"/>
+            </w:pPr>
+            <w:r>
+              <w:t xml:space="preserve">Resource</w:t>
+            </w:r>
+          </w:p>
+        </w:tc>
+        <w:tc>
+          <w:tcPr/>
+          <w:p>
+            <w:pPr>
+              <w:pStyle w:val="Compact"/>
+            </w:pPr>
+            <w:r>
+              <w:t xml:space="preserve">URL</w:t>
+            </w:r>
+          </w:p>
+        </w:tc>
+      </w:tr>
+      <w:tr>
+        <w:tc>
+          <w:tcPr/>
+          <w:p>
+            <w:pPr>
+              <w:pStyle w:val="Compact"/>
+            </w:pPr>
+            <w:r>
+              <w:t xml:space="preserve">Play the game (GitHub Pages)</w:t>
+            </w:r>
+          </w:p>
+        </w:tc>
+        <w:tc>
+          <w:tcPr/>
+          <w:p>
+            <w:pPr>
+              <w:pStyle w:val="Compact"/>
+            </w:pPr>
+            <w:r>
+              <w:t xml:space="preserve">https://caats-kkhan.github.io/agent-factory-tycoon/</w:t>
+            </w:r>
+          </w:p>
+        </w:tc>
+      </w:tr>
+      <w:tr>
+        <w:tc>
+          <w:tcPr/>
+          <w:p>
+            <w:pPr>
+              <w:pStyle w:val="Compact"/>
+            </w:pPr>
+            <w:r>
+              <w:t xml:space="preserve">Source repository</w:t>
+            </w:r>
+          </w:p>
+        </w:tc>
+        <w:tc>
+          <w:tcPr/>
+          <w:p>
+            <w:pPr>
+              <w:pStyle w:val="Compact"/>
+            </w:pPr>
+            <w:r>
+              <w:t xml:space="preserve">https://github.com/CAATs-kkhan/agent-factory-tycoon</w:t>
+            </w:r>
+          </w:p>
+        </w:tc>
+      </w:tr>
+    </w:tbl>
+    <w:p>
+      <w:pPr>
+        <w:pStyle w:val="BodyText"/>
+      </w:pPr>
+      <w:r>
+        <w:t xml:space="preserve">The repository contains the playable</w:t>
+      </w:r>
+      <w:r>
+        <w:t xml:space="preserve"> </w:t>
+      </w:r>
+      <w:r>
+        <w:rPr>
+          <w:rStyle w:val="VerbatimChar"/>
+        </w:rPr>
+        <w:t xml:space="preserve">index.html</w:t>
+      </w:r>
+      <w:r>
+        <w:t xml:space="preserve">, this design document (</w:t>
+      </w:r>
+      <w:r>
+        <w:rPr>
+          <w:rStyle w:val="VerbatimChar"/>
+        </w:rPr>
+        <w:t xml:space="preserve">.md</w:t>
+      </w:r>
+      <w:r>
+        <w:t xml:space="preserve">,</w:t>
+      </w:r>
+      <w:r>
+        <w:t xml:space="preserve"> </w:t>
+      </w:r>
+      <w:r>
+        <w:rPr>
+          <w:rStyle w:val="VerbatimChar"/>
+        </w:rPr>
+        <w:t xml:space="preserve">.docx</w:t>
+      </w:r>
+      <w:r>
+        <w:t xml:space="preserve">,</w:t>
+      </w:r>
+      <w:r>
+        <w:t xml:space="preserve"> </w:t>
+      </w:r>
+      <w:r>
+        <w:rPr>
+          <w:rStyle w:val="VerbatimChar"/>
+        </w:rPr>
+        <w:t xml:space="preserve">.pdf</w:t>
+      </w:r>
+      <w:r>
+        <w:t xml:space="preserve">), and the</w:t>
+      </w:r>
+      <w:r>
+        <w:t xml:space="preserve"> </w:t>
+      </w:r>
+      <w:r>
+        <w:rPr>
+          <w:rStyle w:val="VerbatimChar"/>
+        </w:rPr>
+        <w:t xml:space="preserve">README.md</w:t>
+      </w:r>
+      <w:r>
+        <w:t xml:space="preserve">.</w:t>
+      </w:r>
+    </w:p>
+    <w:bookmarkEnd w:id="127"/>
+    <w:bookmarkStart w:id="128" w:name="one-time-setup-how-it-was-synced"/>
+    <w:p>
+      <w:pPr>
+        <w:pStyle w:val="Heading2"/>
+      </w:pPr>
+      <w:r>
+        <w:t xml:space="preserve">One-Time Setup (how it was synced)</w:t>
+      </w:r>
+    </w:p>
+    <w:p>
+      <w:pPr>
+        <w:pStyle w:val="FirstParagraph"/>
+      </w:pPr>
+      <w:r>
+        <w:t xml:space="preserve">Prerequisites: Git and the GitHub CLI (</w:t>
+      </w:r>
+      <w:r>
+        <w:rPr>
+          <w:rStyle w:val="VerbatimChar"/>
+        </w:rPr>
+        <w:t xml:space="preserve">gh</w:t>
+      </w:r>
+      <w:r>
+        <w:t xml:space="preserve">) installed, and</w:t>
+      </w:r>
+      <w:r>
+        <w:t xml:space="preserve"> </w:t>
+      </w:r>
+      <w:r>
+        <w:rPr>
+          <w:rStyle w:val="VerbatimChar"/>
+        </w:rPr>
+        <w:t xml:space="preserve">gh auth login</w:t>
+      </w:r>
+      <w:r>
+        <w:t xml:space="preserve"> </w:t>
+      </w:r>
+      <w:r>
+        <w:t xml:space="preserve">completed.</w:t>
+      </w:r>
+    </w:p>
+    <w:p>
+      <w:pPr>
+        <w:numPr>
+          <w:ilvl w:val="0"/>
+          <w:numId w:val="1063"/>
+        </w:numPr>
+      </w:pPr>
+      <w:r>
+        <w:rPr>
+          <w:b/>
+          <w:bCs/>
+        </w:rPr>
+        <w:t xml:space="preserve">Initialize the repo</w:t>
+      </w:r>
+      <w:r>
+        <w:t xml:space="preserve"> </w:t>
+      </w:r>
+      <w:r>
+        <w:t xml:space="preserve">(run from inside the game folder):</w:t>
+      </w:r>
+    </w:p>
+    <w:p>
+      <w:pPr>
+        <w:pStyle w:val="SourceCode"/>
+        <w:numPr>
+          <w:ilvl w:val="0"/>
+          <w:numId w:val="1000"/>
+        </w:numPr>
+      </w:pPr>
+      <w:r>
+        <w:rPr>
+          <w:rStyle w:val="FunctionTok"/>
+        </w:rPr>
+        <w:t xml:space="preserve">git</w:t>
+      </w:r>
+      <w:r>
+        <w:rPr>
+          <w:rStyle w:val="NormalTok"/>
+        </w:rPr>
+        <w:t xml:space="preserve"> init</w:t>
+      </w:r>
+      <w:r>
+        <w:br/>
+      </w:r>
+      <w:r>
+        <w:rPr>
+          <w:rStyle w:val="FunctionTok"/>
+        </w:rPr>
+        <w:t xml:space="preserve">git</w:t>
+      </w:r>
+      <w:r>
+        <w:rPr>
+          <w:rStyle w:val="NormalTok"/>
+        </w:rPr>
+        <w:t xml:space="preserve"> add </w:t>
+      </w:r>
+      <w:r>
+        <w:rPr>
+          <w:rStyle w:val="AttributeTok"/>
+        </w:rPr>
+        <w:t xml:space="preserve">-A</w:t>
+      </w:r>
+      <w:r>
+        <w:br/>
+      </w:r>
+      <w:r>
+        <w:rPr>
+          <w:rStyle w:val="FunctionTok"/>
+        </w:rPr>
+        <w:t xml:space="preserve">git</w:t>
+      </w:r>
+      <w:r>
+        <w:rPr>
+          <w:rStyle w:val="NormalTok"/>
+        </w:rPr>
+        <w:t xml:space="preserve"> commit </w:t>
+      </w:r>
+      <w:r>
+        <w:rPr>
+          <w:rStyle w:val="AttributeTok"/>
+        </w:rPr>
+        <w:t xml:space="preserve">-m</w:t>
+      </w:r>
+      <w:r>
+        <w:rPr>
+          <w:rStyle w:val="NormalTok"/>
+        </w:rPr>
+        <w:t xml:space="preserve"> </w:t>
+      </w:r>
+      <w:r>
+        <w:rPr>
+          <w:rStyle w:val="StringTok"/>
+        </w:rPr>
+        <w:t xml:space="preserve">"Agent Factory Tycoon: playable prototype + design docs"</w:t>
+      </w:r>
+      <w:r>
+        <w:br/>
+      </w:r>
+      <w:r>
+        <w:rPr>
+          <w:rStyle w:val="FunctionTok"/>
+        </w:rPr>
+        <w:t xml:space="preserve">git</w:t>
+      </w:r>
+      <w:r>
+        <w:rPr>
+          <w:rStyle w:val="NormalTok"/>
+        </w:rPr>
+        <w:t xml:space="preserve"> branch </w:t>
+      </w:r>
+      <w:r>
+        <w:rPr>
+          <w:rStyle w:val="AttributeTok"/>
+        </w:rPr>
+        <w:t xml:space="preserve">-M</w:t>
+      </w:r>
+      <w:r>
+        <w:rPr>
+          <w:rStyle w:val="NormalTok"/>
+        </w:rPr>
+        <w:t xml:space="preserve"> main</w:t>
+      </w:r>
+    </w:p>
+    <w:p>
+      <w:pPr>
+        <w:numPr>
+          <w:ilvl w:val="0"/>
+          <w:numId w:val="1063"/>
+        </w:numPr>
+      </w:pPr>
+      <w:r>
+        <w:rPr>
+          <w:b/>
+          <w:bCs/>
+        </w:rPr>
+        <w:t xml:space="preserve">Create the GitHub repo and push</w:t>
+      </w:r>
+      <w:r>
+        <w:t xml:space="preserve"> </w:t>
+      </w:r>
+      <w:r>
+        <w:t xml:space="preserve">(the GitHub CLI creates it and pushes in one step):</w:t>
+      </w:r>
+    </w:p>
+    <w:p>
+      <w:pPr>
+        <w:pStyle w:val="SourceCode"/>
+        <w:numPr>
+          <w:ilvl w:val="0"/>
+          <w:numId w:val="1000"/>
+        </w:numPr>
+      </w:pPr>
+      <w:r>
+        <w:rPr>
+          <w:rStyle w:val="ExtensionTok"/>
+        </w:rPr>
+        <w:t xml:space="preserve">gh</w:t>
+      </w:r>
+      <w:r>
+        <w:rPr>
+          <w:rStyle w:val="NormalTok"/>
+        </w:rPr>
+        <w:t xml:space="preserve"> repo create agent-factory-tycoon </w:t>
+      </w:r>
+      <w:r>
+        <w:rPr>
+          <w:rStyle w:val="AttributeTok"/>
+        </w:rPr>
+        <w:t xml:space="preserve">--public</w:t>
+      </w:r>
+      <w:r>
+        <w:rPr>
+          <w:rStyle w:val="NormalTok"/>
+        </w:rPr>
+        <w:t xml:space="preserve"> </w:t>
+      </w:r>
+      <w:r>
+        <w:rPr>
+          <w:rStyle w:val="AttributeTok"/>
+        </w:rPr>
+        <w:t xml:space="preserve">--source</w:t>
+      </w:r>
+      <w:r>
+        <w:rPr>
+          <w:rStyle w:val="OperatorTok"/>
+        </w:rPr>
+        <w:t xml:space="preserve">=</w:t>
+      </w:r>
+      <w:r>
+        <w:rPr>
+          <w:rStyle w:val="NormalTok"/>
+        </w:rPr>
+        <w:t xml:space="preserve">. </w:t>
+      </w:r>
+      <w:r>
+        <w:rPr>
+          <w:rStyle w:val="AttributeTok"/>
+        </w:rPr>
+        <w:t xml:space="preserve">--remote</w:t>
+      </w:r>
+      <w:r>
+        <w:rPr>
+          <w:rStyle w:val="OperatorTok"/>
+        </w:rPr>
+        <w:t xml:space="preserve">=</w:t>
+      </w:r>
+      <w:r>
+        <w:rPr>
+          <w:rStyle w:val="NormalTok"/>
+        </w:rPr>
+        <w:t xml:space="preserve">origin </w:t>
+      </w:r>
+      <w:r>
+        <w:rPr>
+          <w:rStyle w:val="AttributeTok"/>
+        </w:rPr>
+        <w:t xml:space="preserve">--push</w:t>
+      </w:r>
+    </w:p>
+    <w:p>
+      <w:pPr>
+        <w:numPr>
+          <w:ilvl w:val="0"/>
+          <w:numId w:val="1063"/>
+        </w:numPr>
+      </w:pPr>
+      <w:r>
+        <w:rPr>
+          <w:b/>
+          <w:bCs/>
+        </w:rPr>
+        <w:t xml:space="preserve">Enable GitHub Pages</w:t>
+      </w:r>
+      <w:r>
+        <w:t xml:space="preserve"> </w:t>
+      </w:r>
+      <w:r>
+        <w:t xml:space="preserve">(serves the game from the</w:t>
+      </w:r>
+      <w:r>
+        <w:t xml:space="preserve"> </w:t>
+      </w:r>
+      <w:r>
+        <w:rPr>
+          <w:rStyle w:val="VerbatimChar"/>
+        </w:rPr>
+        <w:t xml:space="preserve">main</w:t>
+      </w:r>
+      <w:r>
+        <w:t xml:space="preserve"> </w:t>
+      </w:r>
+      <w:r>
+        <w:t xml:space="preserve">branch root):</w:t>
+      </w:r>
+    </w:p>
+    <w:p>
+      <w:pPr>
+        <w:pStyle w:val="SourceCode"/>
+        <w:numPr>
+          <w:ilvl w:val="0"/>
+          <w:numId w:val="1000"/>
+        </w:numPr>
+      </w:pPr>
+      <w:r>
+        <w:rPr>
+          <w:rStyle w:val="ExtensionTok"/>
+        </w:rPr>
+        <w:t xml:space="preserve">gh</w:t>
+      </w:r>
+      <w:r>
+        <w:rPr>
+          <w:rStyle w:val="NormalTok"/>
+        </w:rPr>
+        <w:t xml:space="preserve"> api </w:t>
+      </w:r>
+      <w:r>
+        <w:rPr>
+          <w:rStyle w:val="AttributeTok"/>
+        </w:rPr>
+        <w:t xml:space="preserve">-X</w:t>
+      </w:r>
+      <w:r>
+        <w:rPr>
+          <w:rStyle w:val="NormalTok"/>
+        </w:rPr>
+        <w:t xml:space="preserve"> POST repos/CAATs-kkhan/agent-factory-tycoon/pages </w:t>
+      </w:r>
+      <w:r>
+        <w:rPr>
+          <w:rStyle w:val="DataTypeTok"/>
+        </w:rPr>
+        <w:t xml:space="preserve">\</w:t>
+      </w:r>
+      <w:r>
+        <w:br/>
+      </w:r>
+      <w:r>
+        <w:rPr>
+          <w:rStyle w:val="NormalTok"/>
+        </w:rPr>
+        <w:t xml:space="preserve">  </w:t>
+      </w:r>
+      <w:r>
+        <w:rPr>
+          <w:rStyle w:val="AttributeTok"/>
+        </w:rPr>
+        <w:t xml:space="preserve">-f</w:t>
+      </w:r>
+      <w:r>
+        <w:rPr>
+          <w:rStyle w:val="NormalTok"/>
+        </w:rPr>
+        <w:t xml:space="preserve"> </w:t>
+      </w:r>
+      <w:r>
+        <w:rPr>
+          <w:rStyle w:val="StringTok"/>
+        </w:rPr>
+        <w:t xml:space="preserve">"source[branch]=main"</w:t>
+      </w:r>
+      <w:r>
+        <w:rPr>
+          <w:rStyle w:val="NormalTok"/>
+        </w:rPr>
+        <w:t xml:space="preserve"> </w:t>
+      </w:r>
+      <w:r>
+        <w:rPr>
+          <w:rStyle w:val="AttributeTok"/>
+        </w:rPr>
+        <w:t xml:space="preserve">-f</w:t>
+      </w:r>
+      <w:r>
+        <w:rPr>
+          <w:rStyle w:val="NormalTok"/>
+        </w:rPr>
+        <w:t xml:space="preserve"> </w:t>
+      </w:r>
+      <w:r>
+        <w:rPr>
+          <w:rStyle w:val="StringTok"/>
+        </w:rPr>
+        <w:t xml:space="preserve">"source[path]=/"</w:t>
+      </w:r>
+    </w:p>
+    <w:p>
+      <w:pPr>
+        <w:numPr>
+          <w:ilvl w:val="0"/>
+          <w:numId w:val="1000"/>
+        </w:numPr>
+      </w:pPr>
+      <w:r>
+        <w:t xml:space="preserve">After about 1–2 minutes the game is live at the Pages URL above. Verify the build with:</w:t>
+      </w:r>
+    </w:p>
+    <w:p>
+      <w:pPr>
+        <w:pStyle w:val="SourceCode"/>
+        <w:numPr>
+          <w:ilvl w:val="0"/>
+          <w:numId w:val="1000"/>
+        </w:numPr>
+      </w:pPr>
+      <w:r>
+        <w:rPr>
+          <w:rStyle w:val="ExtensionTok"/>
+        </w:rPr>
+        <w:t xml:space="preserve">gh</w:t>
+      </w:r>
+      <w:r>
+        <w:rPr>
+          <w:rStyle w:val="NormalTok"/>
+        </w:rPr>
+        <w:t xml:space="preserve"> api repos/CAATs-kkhan/agent-factory-tycoon/pages/builds/latest </w:t>
+      </w:r>
+      <w:r>
+        <w:rPr>
+          <w:rStyle w:val="AttributeTok"/>
+        </w:rPr>
+        <w:t xml:space="preserve">--jq</w:t>
+      </w:r>
+      <w:r>
+        <w:rPr>
+          <w:rStyle w:val="NormalTok"/>
+        </w:rPr>
+        <w:t xml:space="preserve"> .status</w:t>
+      </w:r>
+    </w:p>
+    <w:bookmarkEnd w:id="128"/>
+    <w:bookmarkStart w:id="129" w:name="update-workflow-for-every-future-change"/>
+    <w:p>
+      <w:pPr>
+        <w:pStyle w:val="Heading2"/>
+      </w:pPr>
+      <w:r>
+        <w:t xml:space="preserve">Update Workflow (for every future change)</w:t>
+      </w:r>
+    </w:p>
+    <w:p>
+      <w:pPr>
+        <w:pStyle w:val="FirstParagraph"/>
+      </w:pPr>
+      <w:r>
+        <w:t xml:space="preserve">After editing</w:t>
+      </w:r>
+      <w:r>
+        <w:t xml:space="preserve"> </w:t>
+      </w:r>
+      <w:r>
+        <w:rPr>
+          <w:rStyle w:val="VerbatimChar"/>
+        </w:rPr>
+        <w:t xml:space="preserve">index.html</w:t>
+      </w:r>
+      <w:r>
+        <w:t xml:space="preserve"> </w:t>
+      </w:r>
+      <w:r>
+        <w:t xml:space="preserve">(or any file), publish the change:</w:t>
+      </w:r>
+    </w:p>
+    <w:p>
+      <w:pPr>
+        <w:pStyle w:val="SourceCode"/>
+      </w:pPr>
+      <w:r>
+        <w:rPr>
+          <w:rStyle w:val="FunctionTok"/>
+        </w:rPr>
+        <w:t xml:space="preserve">git</w:t>
+      </w:r>
+      <w:r>
+        <w:rPr>
+          <w:rStyle w:val="NormalTok"/>
+        </w:rPr>
+        <w:t xml:space="preserve"> add </w:t>
+      </w:r>
+      <w:r>
+        <w:rPr>
+          <w:rStyle w:val="AttributeTok"/>
+        </w:rPr>
+        <w:t xml:space="preserve">-A</w:t>
+      </w:r>
+      <w:r>
+        <w:br/>
+      </w:r>
+      <w:r>
+        <w:rPr>
+          <w:rStyle w:val="FunctionTok"/>
+        </w:rPr>
+        <w:t xml:space="preserve">git</w:t>
+      </w:r>
+      <w:r>
+        <w:rPr>
+          <w:rStyle w:val="NormalTok"/>
+        </w:rPr>
+        <w:t xml:space="preserve"> commit </w:t>
+      </w:r>
+      <w:r>
+        <w:rPr>
+          <w:rStyle w:val="AttributeTok"/>
+        </w:rPr>
+        <w:t xml:space="preserve">-m</w:t>
+      </w:r>
+      <w:r>
+        <w:rPr>
+          <w:rStyle w:val="NormalTok"/>
+        </w:rPr>
+        <w:t xml:space="preserve"> </w:t>
+      </w:r>
+      <w:r>
+        <w:rPr>
+          <w:rStyle w:val="StringTok"/>
+        </w:rPr>
+        <w:t xml:space="preserve">"describe your change"</w:t>
+      </w:r>
+      <w:r>
+        <w:br/>
+      </w:r>
+      <w:r>
+        <w:rPr>
+          <w:rStyle w:val="FunctionTok"/>
+        </w:rPr>
+        <w:t xml:space="preserve">git</w:t>
+      </w:r>
+      <w:r>
+        <w:rPr>
+          <w:rStyle w:val="NormalTok"/>
+        </w:rPr>
+        <w:t xml:space="preserve"> push</w:t>
+      </w:r>
+    </w:p>
+    <w:p>
+      <w:pPr>
+        <w:pStyle w:val="FirstParagraph"/>
+      </w:pPr>
+      <w:r>
+        <w:t xml:space="preserve">GitHub Pages automatically rebuilds within about 1–2 minutes. Hard-refresh the live page (</w:t>
+      </w:r>
+      <w:r>
+        <w:rPr>
+          <w:rStyle w:val="VerbatimChar"/>
+        </w:rPr>
+        <w:t xml:space="preserve">Ctrl + F5</w:t>
+      </w:r>
+      <w:r>
+        <w:t xml:space="preserve">) to bypass the browser cache and see the update.</w:t>
+      </w:r>
+    </w:p>
+    <w:bookmarkEnd w:id="129"/>
+    <w:bookmarkStart w:id="130" w:name="regenerating-the-documents"/>
+    <w:p>
+      <w:pPr>
+        <w:pStyle w:val="Heading2"/>
+      </w:pPr>
+      <w:r>
+        <w:t xml:space="preserve">Regenerating the Documents</w:t>
+      </w:r>
+    </w:p>
+    <w:p>
+      <w:pPr>
+        <w:pStyle w:val="FirstParagraph"/>
+      </w:pPr>
+      <w:r>
+        <w:t xml:space="preserve">If the design document Markdown changes, rebuild the</w:t>
+      </w:r>
+      <w:r>
+        <w:t xml:space="preserve"> </w:t>
+      </w:r>
+      <w:r>
+        <w:rPr>
+          <w:rStyle w:val="VerbatimChar"/>
+        </w:rPr>
+        <w:t xml:space="preserve">.docx</w:t>
+      </w:r>
+      <w:r>
+        <w:t xml:space="preserve"> </w:t>
+      </w:r>
+      <w:r>
+        <w:t xml:space="preserve">and</w:t>
+      </w:r>
+      <w:r>
+        <w:t xml:space="preserve"> </w:t>
+      </w:r>
+      <w:r>
+        <w:rPr>
+          <w:rStyle w:val="VerbatimChar"/>
+        </w:rPr>
+        <w:t xml:space="preserve">.pdf</w:t>
+      </w:r>
+      <w:r>
+        <w:t xml:space="preserve"> </w:t>
+      </w:r>
+      <w:r>
+        <w:t xml:space="preserve">(see the README for the exact commands), then commit and push them alongside the source so the repository stays in sync.</w:t>
+      </w:r>
+    </w:p>
+    <w:p>
+      <w:r>
+        <w:pict>
+          <v:rect style="width:0;height:1.5pt" o:hralign="center" o:hrstd="t" o:hr="t"/>
+        </w:pict>
+      </w:r>
+    </w:p>
+    <w:bookmarkEnd w:id="130"/>
+    <w:bookmarkEnd w:id="131"/>
+    <w:bookmarkStart w:id="138" w:name="sources"/>
+    <w:p>
+      <w:pPr>
+        <w:pStyle w:val="Heading1"/>
+      </w:pPr>
+      <w:r>
         <w:t xml:space="preserve">Sources</w:t>
       </w:r>
     </w:p>
@@ -18040,7 +18827,7 @@
         <w:pStyle w:val="Compact"/>
         <w:numPr>
           <w:ilvl w:val="0"/>
-          <w:numId w:val="1063"/>
+          <w:numId w:val="1064"/>
         </w:numPr>
       </w:pPr>
       <w:r>
@@ -18049,7 +18836,7 @@
       <w:r>
         <w:t xml:space="preserve"> </w:t>
       </w:r>
-      <w:hyperlink r:id="rId127">
+      <w:hyperlink r:id="rId132">
         <w:r>
           <w:rPr>
             <w:rStyle w:val="Hyperlink"/>
@@ -18063,7 +18850,7 @@
         <w:pStyle w:val="Compact"/>
         <w:numPr>
           <w:ilvl w:val="0"/>
-          <w:numId w:val="1063"/>
+          <w:numId w:val="1064"/>
         </w:numPr>
       </w:pPr>
       <w:r>
@@ -18072,7 +18859,7 @@
       <w:r>
         <w:t xml:space="preserve"> </w:t>
       </w:r>
-      <w:hyperlink r:id="rId128">
+      <w:hyperlink r:id="rId133">
         <w:r>
           <w:rPr>
             <w:rStyle w:val="Hyperlink"/>
@@ -18086,7 +18873,7 @@
         <w:pStyle w:val="Compact"/>
         <w:numPr>
           <w:ilvl w:val="0"/>
-          <w:numId w:val="1063"/>
+          <w:numId w:val="1064"/>
         </w:numPr>
       </w:pPr>
       <w:r>
@@ -18095,7 +18882,7 @@
       <w:r>
         <w:t xml:space="preserve"> </w:t>
       </w:r>
-      <w:hyperlink r:id="rId129">
+      <w:hyperlink r:id="rId134">
         <w:r>
           <w:rPr>
             <w:rStyle w:val="Hyperlink"/>
@@ -18109,7 +18896,7 @@
         <w:pStyle w:val="Compact"/>
         <w:numPr>
           <w:ilvl w:val="0"/>
-          <w:numId w:val="1063"/>
+          <w:numId w:val="1064"/>
         </w:numPr>
       </w:pPr>
       <w:r>
@@ -18118,7 +18905,7 @@
       <w:r>
         <w:t xml:space="preserve"> </w:t>
       </w:r>
-      <w:hyperlink r:id="rId130">
+      <w:hyperlink r:id="rId135">
         <w:r>
           <w:rPr>
             <w:rStyle w:val="Hyperlink"/>
@@ -18132,7 +18919,7 @@
         <w:pStyle w:val="Compact"/>
         <w:numPr>
           <w:ilvl w:val="0"/>
-          <w:numId w:val="1063"/>
+          <w:numId w:val="1064"/>
         </w:numPr>
       </w:pPr>
       <w:r>
@@ -18141,7 +18928,7 @@
       <w:r>
         <w:t xml:space="preserve"> </w:t>
       </w:r>
-      <w:hyperlink r:id="rId131">
+      <w:hyperlink r:id="rId136">
         <w:r>
           <w:rPr>
             <w:rStyle w:val="Hyperlink"/>
@@ -18155,7 +18942,7 @@
         <w:pStyle w:val="Compact"/>
         <w:numPr>
           <w:ilvl w:val="0"/>
-          <w:numId w:val="1063"/>
+          <w:numId w:val="1064"/>
         </w:numPr>
       </w:pPr>
       <w:r>
@@ -18164,7 +18951,7 @@
       <w:r>
         <w:t xml:space="preserve"> </w:t>
       </w:r>
-      <w:hyperlink r:id="rId132">
+      <w:hyperlink r:id="rId137">
         <w:r>
           <w:rPr>
             <w:rStyle w:val="Hyperlink"/>
@@ -18173,7 +18960,7 @@
         </w:r>
       </w:hyperlink>
     </w:p>
-    <w:bookmarkEnd w:id="133"/>
+    <w:bookmarkEnd w:id="138"/>
     <w:sectPr>
       <w:footnotePr>
         <w:numRestart w:val="eachSect"/>
@@ -18689,6 +19476,36 @@
     <w:abstractNumId w:val="991"/>
   </w:num>
   <w:num w:numId="1063">
+    <w:abstractNumId w:val="99411"/>
+    <w:lvlOverride w:ilvl="0">
+      <w:startOverride w:val="1"/>
+    </w:lvlOverride>
+    <w:lvlOverride w:ilvl="1">
+      <w:startOverride w:val="1"/>
+    </w:lvlOverride>
+    <w:lvlOverride w:ilvl="2">
+      <w:startOverride w:val="1"/>
+    </w:lvlOverride>
+    <w:lvlOverride w:ilvl="3">
+      <w:startOverride w:val="1"/>
+    </w:lvlOverride>
+    <w:lvlOverride w:ilvl="4">
+      <w:startOverride w:val="1"/>
+    </w:lvlOverride>
+    <w:lvlOverride w:ilvl="5">
+      <w:startOverride w:val="1"/>
+    </w:lvlOverride>
+    <w:lvlOverride w:ilvl="6">
+      <w:startOverride w:val="1"/>
+    </w:lvlOverride>
+    <w:lvlOverride w:ilvl="7">
+      <w:startOverride w:val="1"/>
+    </w:lvlOverride>
+    <w:lvlOverride w:ilvl="8">
+      <w:startOverride w:val="1"/>
+    </w:lvlOverride>
+  </w:num>
+  <w:num w:numId="1064">
     <w:abstractNumId w:val="991"/>
   </w:num>
 </w:numbering>

</xml_diff>

<commit_message>
Add Play online link and badge to the concept document
Regenerate docx and pdf.

Co-Authored-By: Claude Opus 4.8 <noreply@anthropic.com>
</commit_message>
<xml_diff>
--- a/Agent_Factory_Tycoon_Concept.docx
+++ b/Agent_Factory_Tycoon_Concept.docx
@@ -59,7 +59,7 @@
         </w:pict>
       </w:r>
     </w:p>
-    <w:bookmarkStart w:id="11" w:name="agent-factory-tycoon"/>
+    <w:bookmarkStart w:id="16" w:name="agent-factory-tycoon"/>
     <w:p>
       <w:pPr>
         <w:pStyle w:val="Heading1"/>
@@ -68,7 +68,7 @@
         <w:t xml:space="preserve">Agent Factory Tycoon</w:t>
       </w:r>
     </w:p>
-    <w:bookmarkStart w:id="10" w:name="X98b55774cf0adc7b85b8b9726281ad2f5e353dc"/>
+    <w:bookmarkStart w:id="15" w:name="X98b55774cf0adc7b85b8b9726281ad2f5e353dc"/>
     <w:p>
       <w:pPr>
         <w:pStyle w:val="Heading2"/>
@@ -93,6 +93,90 @@
         <w:t xml:space="preserve">An educational game concept that teaches Agentic AI, Digital FTEs, and Spec-Driven Development through play.</w:t>
       </w:r>
     </w:p>
+    <w:bookmarkStart w:id="14" w:name="X6ab9ed35fab8ebfcbc63cc36df66eba2ce7be5b"/>
+    <w:p>
+      <w:pPr>
+        <w:pStyle w:val="Heading3"/>
+      </w:pPr>
+      <w:r>
+        <w:t xml:space="preserve">▶</w:t>
+      </w:r>
+      <w:r>
+        <w:t xml:space="preserve"> </w:t>
+      </w:r>
+      <w:hyperlink r:id="rId9">
+        <w:r>
+          <w:rPr>
+            <w:rStyle w:val="Hyperlink"/>
+          </w:rPr>
+          <w:t xml:space="preserve">Play the game online</w:t>
+        </w:r>
+      </w:hyperlink>
+      <w:r>
+        <w:t xml:space="preserve"> </w:t>
+      </w:r>
+      <w:r>
+        <w:t xml:space="preserve">— runs in any browser, no install</w:t>
+      </w:r>
+    </w:p>
+    <w:p>
+      <w:pPr>
+        <w:pStyle w:val="FirstParagraph"/>
+      </w:pPr>
+      <w:hyperlink r:id="rId9">
+        <w:r>
+          <w:drawing>
+            <wp:inline>
+              <wp:extent cx="2466975" cy="266700"/>
+              <wp:effectExtent b="0" l="0" r="0" t="0"/>
+              <wp:docPr descr="Play Agent Factory Tycoon" title="" id="11" name="Picture"/>
+              <a:graphic>
+                <a:graphicData uri="http://schemas.openxmlformats.org/drawingml/2006/picture">
+                  <pic:pic>
+                    <pic:nvPicPr>
+                      <pic:cNvPr descr="https://img.shields.io/badge/▶%20Play-Agent%20Factory%20Tycoon-6D28D9?style=for-the-badge" id="12" name="Picture"/>
+                      <pic:cNvPicPr>
+                        <a:picLocks noChangeArrowheads="1" noChangeAspect="1"/>
+                      </pic:cNvPicPr>
+                    </pic:nvPicPr>
+                    <pic:blipFill>
+                      <a:blip>
+                        <a:extLst>
+                          <a:ext uri="{28A0092B-C50C-407E-A947-70E740481C1C}">
+                            <a14:useLocalDpi xmlns:a14="http://schemas.microsoft.com/office/drawing/2010/main" val="0"/>
+                          </a:ext>
+                          <a:ext uri="{96DAC541-7B7A-43D3-8B79-37D633B846F1}">
+                            <asvg:svgBlip xmlns:asvg="http://schemas.microsoft.com/office/drawing/2016/SVG/main" r:embed="rId10"/>
+                          </a:ext>
+                        </a:extLst>
+                      </a:blip>
+                      <a:stretch>
+                        <a:fillRect/>
+                      </a:stretch>
+                    </pic:blipFill>
+                    <pic:spPr bwMode="auto">
+                      <a:xfrm>
+                        <a:off x="0" y="0"/>
+                        <a:ext cx="2466975" cy="266700"/>
+                      </a:xfrm>
+                      <a:prstGeom prst="rect">
+                        <a:avLst/>
+                      </a:prstGeom>
+                      <a:noFill/>
+                      <a:ln w="9525">
+                        <a:noFill/>
+                        <a:headEnd/>
+                        <a:tailEnd/>
+                      </a:ln>
+                    </pic:spPr>
+                  </pic:pic>
+                </a:graphicData>
+              </a:graphic>
+            </wp:inline>
+          </w:drawing>
+        </w:r>
+      </w:hyperlink>
+    </w:p>
     <w:p>
       <w:pPr>
         <w:pStyle w:val="BodyText"/>
@@ -103,7 +187,7 @@
       <w:r>
         <w:t xml:space="preserve"> </w:t>
       </w:r>
-      <w:hyperlink r:id="rId9">
+      <w:hyperlink r:id="rId13">
         <w:r>
           <w:rPr>
             <w:rStyle w:val="Hyperlink"/>
@@ -119,9 +203,10 @@
         </w:pict>
       </w:r>
     </w:p>
-    <w:bookmarkEnd w:id="10"/>
-    <w:bookmarkEnd w:id="11"/>
-    <w:bookmarkStart w:id="12" w:name="executive-summary"/>
+    <w:bookmarkEnd w:id="14"/>
+    <w:bookmarkEnd w:id="15"/>
+    <w:bookmarkEnd w:id="16"/>
+    <w:bookmarkStart w:id="17" w:name="executive-summary"/>
     <w:p>
       <w:pPr>
         <w:pStyle w:val="Heading1"/>
@@ -457,8 +542,8 @@
         </w:pict>
       </w:r>
     </w:p>
-    <w:bookmarkEnd w:id="12"/>
-    <w:bookmarkStart w:id="24" w:name="part-1-concept-paper"/>
+    <w:bookmarkEnd w:id="17"/>
+    <w:bookmarkStart w:id="29" w:name="part-1-concept-paper"/>
     <w:p>
       <w:pPr>
         <w:pStyle w:val="Heading1"/>
@@ -467,7 +552,7 @@
         <w:t xml:space="preserve">Part 1 — Concept Paper</w:t>
       </w:r>
     </w:p>
-    <w:bookmarkStart w:id="13" w:name="what-is-a-concept-paper"/>
+    <w:bookmarkStart w:id="18" w:name="what-is-a-concept-paper"/>
     <w:p>
       <w:pPr>
         <w:pStyle w:val="Heading2"/>
@@ -512,8 +597,8 @@
         <w:t xml:space="preserve">that aligns everyone before a single line of code is written. This document is that blueprint.</w:t>
       </w:r>
     </w:p>
-    <w:bookmarkEnd w:id="13"/>
-    <w:bookmarkStart w:id="14" w:name="the-core-idea-one-sentence"/>
+    <w:bookmarkEnd w:id="18"/>
+    <w:bookmarkStart w:id="19" w:name="the-core-idea-one-sentence"/>
     <w:p>
       <w:pPr>
         <w:pStyle w:val="Heading2"/>
@@ -615,8 +700,8 @@
         <w:t xml:space="preserve">) where, without realizing it, the player learns real Agentic AI concepts.</w:t>
       </w:r>
     </w:p>
-    <w:bookmarkEnd w:id="14"/>
-    <w:bookmarkStart w:id="15" w:name="target-audience"/>
+    <w:bookmarkEnd w:id="19"/>
+    <w:bookmarkStart w:id="20" w:name="target-audience"/>
     <w:p>
       <w:pPr>
         <w:pStyle w:val="Heading2"/>
@@ -759,8 +844,8 @@
         <w:t xml:space="preserve">“your agent could do better, try again.”</w:t>
       </w:r>
     </w:p>
-    <w:bookmarkEnd w:id="15"/>
-    <w:bookmarkStart w:id="16" w:name="X70c273889b9a0262fd015b562cae579a9f9e7f1"/>
+    <w:bookmarkEnd w:id="20"/>
+    <w:bookmarkStart w:id="21" w:name="X70c273889b9a0262fd015b562cae579a9f9e7f1"/>
     <w:p>
       <w:pPr>
         <w:pStyle w:val="Heading2"/>
@@ -1008,8 +1093,8 @@
         </w:tc>
       </w:tr>
     </w:tbl>
-    <w:bookmarkEnd w:id="16"/>
-    <w:bookmarkStart w:id="17" w:name="core-gameplay-loop-easy-addictive"/>
+    <w:bookmarkEnd w:id="21"/>
+    <w:bookmarkStart w:id="22" w:name="core-gameplay-loop-easy-addictive"/>
     <w:p>
       <w:pPr>
         <w:pStyle w:val="Heading2"/>
@@ -1107,8 +1192,8 @@
         <w:t xml:space="preserve">— perfect for quick, satisfying sessions.</w:t>
       </w:r>
     </w:p>
-    <w:bookmarkEnd w:id="17"/>
-    <w:bookmarkStart w:id="18" w:name="X218b1918265e7867ceff274fb64abe236e2ed6f"/>
+    <w:bookmarkEnd w:id="22"/>
+    <w:bookmarkStart w:id="23" w:name="X218b1918265e7867ceff274fb64abe236e2ed6f"/>
     <w:p>
       <w:pPr>
         <w:pStyle w:val="Heading2"/>
@@ -1381,8 +1466,8 @@
         <w:t xml:space="preserve">— 26 short levels mirror the 26 crash courses. Each unlock is a new part, tool, or worker type.</w:t>
       </w:r>
     </w:p>
-    <w:bookmarkEnd w:id="18"/>
-    <w:bookmarkStart w:id="19" w:name="visual-audio-design-good-graphics"/>
+    <w:bookmarkEnd w:id="23"/>
+    <w:bookmarkStart w:id="24" w:name="visual-audio-design-good-graphics"/>
     <w:p>
       <w:pPr>
         <w:pStyle w:val="Heading2"/>
@@ -1535,8 +1620,8 @@
         <w:t xml:space="preserve">screen-shake on big wins, confetti on level-up, particle sparkles on assembly.</w:t>
       </w:r>
     </w:p>
-    <w:bookmarkEnd w:id="19"/>
-    <w:bookmarkStart w:id="20" w:name="Xd4a865cb636429a3c9468a5242199ec053dbbc3"/>
+    <w:bookmarkEnd w:id="24"/>
+    <w:bookmarkStart w:id="25" w:name="Xd4a865cb636429a3c9468a5242199ec053dbbc3"/>
     <w:p>
       <w:pPr>
         <w:pStyle w:val="Heading2"/>
@@ -1647,8 +1732,8 @@
         <w:t xml:space="preserve">“Your night-shift FTE earned 200 coins!”</w:t>
       </w:r>
     </w:p>
-    <w:bookmarkEnd w:id="20"/>
-    <w:bookmarkStart w:id="21" w:name="suggested-tech-stack"/>
+    <w:bookmarkEnd w:id="25"/>
+    <w:bookmarkStart w:id="26" w:name="suggested-tech-stack"/>
     <w:p>
       <w:pPr>
         <w:pStyle w:val="Heading2"/>
@@ -1745,8 +1830,8 @@
         <w:t xml:space="preserve">lightweight save/leaderboard service</w:t>
       </w:r>
     </w:p>
-    <w:bookmarkEnd w:id="21"/>
-    <w:bookmarkStart w:id="22" w:name="mvp-scope-what-to-build-first"/>
+    <w:bookmarkEnd w:id="26"/>
+    <w:bookmarkStart w:id="27" w:name="mvp-scope-what-to-build-first"/>
     <w:p>
       <w:pPr>
         <w:pStyle w:val="Heading2"/>
@@ -1839,8 +1924,8 @@
         <w:t xml:space="preserve">loop, the concept works — then scale up.</w:t>
       </w:r>
     </w:p>
-    <w:bookmarkEnd w:id="22"/>
-    <w:bookmarkStart w:id="23" w:name="why-this-works"/>
+    <w:bookmarkEnd w:id="27"/>
+    <w:bookmarkStart w:id="28" w:name="why-this-works"/>
     <w:p>
       <w:pPr>
         <w:pStyle w:val="Heading2"/>
@@ -1966,9 +2051,9 @@
         </w:pict>
       </w:r>
     </w:p>
-    <w:bookmarkEnd w:id="23"/>
-    <w:bookmarkEnd w:id="24"/>
-    <w:bookmarkStart w:id="34" w:name="X2cb5bedd37b642d81d3334e4b50491f71763b65"/>
+    <w:bookmarkEnd w:id="28"/>
+    <w:bookmarkEnd w:id="29"/>
+    <w:bookmarkStart w:id="39" w:name="X2cb5bedd37b642d81d3334e4b50491f71763b65"/>
     <w:p>
       <w:pPr>
         <w:pStyle w:val="Heading1"/>
@@ -2033,7 +2118,7 @@
         <w:t xml:space="preserve">Tutorial (impossible to lose)</w:t>
       </w:r>
     </w:p>
-    <w:bookmarkStart w:id="25" w:name="scene-0-opening-cinematic-8-seconds"/>
+    <w:bookmarkStart w:id="30" w:name="scene-0-opening-cinematic-8-seconds"/>
     <w:p>
       <w:pPr>
         <w:pStyle w:val="Heading2"/>
@@ -2159,8 +2244,8 @@
         <w:t xml:space="preserve">, not just its tools. (Thesis: Digital FTEs are the unit of business value.)</w:t>
       </w:r>
     </w:p>
-    <w:bookmarkEnd w:id="25"/>
-    <w:bookmarkStart w:id="26" w:name="scene-1-a-customer-arrives"/>
+    <w:bookmarkEnd w:id="30"/>
+    <w:bookmarkStart w:id="31" w:name="scene-1-a-customer-arrives"/>
     <w:p>
       <w:pPr>
         <w:pStyle w:val="Heading2"/>
@@ -2283,8 +2368,8 @@
         <w:t xml:space="preserve">(Mode 1 vs. Mode 2).</w:t>
       </w:r>
     </w:p>
-    <w:bookmarkEnd w:id="26"/>
-    <w:bookmarkStart w:id="27" w:name="scene-2-the-worker-builder-core-mechanic"/>
+    <w:bookmarkEnd w:id="31"/>
+    <w:bookmarkStart w:id="32" w:name="scene-2-the-worker-builder-core-mechanic"/>
     <w:p>
       <w:pPr>
         <w:pStyle w:val="Heading2"/>
@@ -2439,8 +2524,8 @@
         <w:t xml:space="preserve">“A tool waits for a prompt; a Digital FTE runs on its own.”</w:t>
       </w:r>
     </w:p>
-    <w:bookmarkEnd w:id="27"/>
-    <w:bookmarkStart w:id="28" w:name="X9745642aa323e31a17343788dc3185671c53505"/>
+    <w:bookmarkEnd w:id="32"/>
+    <w:bookmarkStart w:id="33" w:name="X9745642aa323e31a17343788dc3185671c53505"/>
     <w:p>
       <w:pPr>
         <w:pStyle w:val="Heading2"/>
@@ -2673,8 +2758,8 @@
         <w:t xml:space="preserve">The single most important lesson, taught through play.</w:t>
       </w:r>
     </w:p>
-    <w:bookmarkEnd w:id="28"/>
-    <w:bookmarkStart w:id="29" w:name="scene-4-press-go-work-animation"/>
+    <w:bookmarkEnd w:id="33"/>
+    <w:bookmarkStart w:id="34" w:name="scene-4-press-go-work-animation"/>
     <w:p>
       <w:pPr>
         <w:pStyle w:val="Heading2"/>
@@ -2777,8 +2862,8 @@
         <w:t xml:space="preserve">its Brain + Hands + Training to deliver an outcome — the full Digital FTE in action.</w:t>
       </w:r>
     </w:p>
-    <w:bookmarkEnd w:id="29"/>
-    <w:bookmarkStart w:id="30" w:name="scene-5-verify-human-in-the-loop"/>
+    <w:bookmarkEnd w:id="34"/>
+    <w:bookmarkStart w:id="35" w:name="scene-5-verify-human-in-the-loop"/>
     <w:p>
       <w:pPr>
         <w:pStyle w:val="Heading2"/>
@@ -2900,8 +2985,8 @@
         <w:t xml:space="preserve">“Humans define intent. Agents execute. Humans verify outcomes.”</w:t>
       </w:r>
     </w:p>
-    <w:bookmarkEnd w:id="30"/>
-    <w:bookmarkStart w:id="31" w:name="scene-6-rewards-the-idle-hook"/>
+    <w:bookmarkEnd w:id="35"/>
+    <w:bookmarkStart w:id="36" w:name="scene-6-rewards-the-idle-hook"/>
     <w:p>
       <w:pPr>
         <w:pStyle w:val="Heading2"/>
@@ -2996,8 +3081,8 @@
         <w:t xml:space="preserve">Autonomous workers create value continuously (the idle-earning loop and retention hook).</w:t>
       </w:r>
     </w:p>
-    <w:bookmarkEnd w:id="31"/>
-    <w:bookmarkStart w:id="32" w:name="X0b80be59b2359394ea4f31ad127571410ec9423"/>
+    <w:bookmarkEnd w:id="36"/>
+    <w:bookmarkStart w:id="37" w:name="X0b80be59b2359394ea4f31ad127571410ec9423"/>
     <w:p>
       <w:pPr>
         <w:pStyle w:val="Heading2"/>
@@ -3072,8 +3157,8 @@
         <w:t xml:space="preserve">Bridges the game to the actual AgentFactory crash courses — turning fun into a real learning funnel.</w:t>
       </w:r>
     </w:p>
-    <w:bookmarkEnd w:id="32"/>
-    <w:bookmarkStart w:id="33" w:name="level-1-concept-map-summary"/>
+    <w:bookmarkEnd w:id="37"/>
+    <w:bookmarkStart w:id="38" w:name="level-1-concept-map-summary"/>
     <w:p>
       <w:pPr>
         <w:pStyle w:val="Heading2"/>
@@ -3420,9 +3505,9 @@
         </w:pict>
       </w:r>
     </w:p>
-    <w:bookmarkEnd w:id="33"/>
-    <w:bookmarkEnd w:id="34"/>
-    <w:bookmarkStart w:id="40" w:name="part-3-full-26-level-progression-map"/>
+    <w:bookmarkEnd w:id="38"/>
+    <w:bookmarkEnd w:id="39"/>
+    <w:bookmarkStart w:id="45" w:name="part-3-full-26-level-progression-map"/>
     <w:p>
       <w:pPr>
         <w:pStyle w:val="Heading1"/>
@@ -3481,7 +3566,7 @@
         <w:t xml:space="preserve">crash-course list. The game level names and mechanics are an original design that maps each course to a playable level.</w:t>
       </w:r>
     </w:p>
-    <w:bookmarkStart w:id="35" w:name="X50baa90b50bf7065b5e19d027769d9994cec46d"/>
+    <w:bookmarkStart w:id="40" w:name="X50baa90b50bf7065b5e19d027769d9994cec46d"/>
     <w:p>
       <w:pPr>
         <w:pStyle w:val="Heading2"/>
@@ -3997,8 +4082,8 @@
         </w:tc>
       </w:tr>
     </w:tbl>
-    <w:bookmarkEnd w:id="35"/>
-    <w:bookmarkStart w:id="36" w:name="X256643b3d732e1f9deb54ccf5e12d1ecdf6a015"/>
+    <w:bookmarkEnd w:id="40"/>
+    <w:bookmarkStart w:id="41" w:name="X256643b3d732e1f9deb54ccf5e12d1ecdf6a015"/>
     <w:p>
       <w:pPr>
         <w:pStyle w:val="Heading2"/>
@@ -4337,8 +4422,8 @@
         <w:t xml:space="preserve">side-levels) or Mode 2 (the Manufacturing campaign, Worlds 3–4, the main game).</w:t>
       </w:r>
     </w:p>
-    <w:bookmarkEnd w:id="36"/>
-    <w:bookmarkStart w:id="37" w:name="X05302992fb81fc59b863da5c77b8c534d970ca5"/>
+    <w:bookmarkEnd w:id="41"/>
+    <w:bookmarkStart w:id="42" w:name="X05302992fb81fc59b863da5c77b8c534d970ca5"/>
     <w:p>
       <w:pPr>
         <w:pStyle w:val="Heading2"/>
@@ -5194,8 +5279,8 @@
         </w:tc>
       </w:tr>
     </w:tbl>
-    <w:bookmarkEnd w:id="37"/>
-    <w:bookmarkStart w:id="38" w:name="X39ca26358e22f97022665c9c7b181532d078857"/>
+    <w:bookmarkEnd w:id="42"/>
+    <w:bookmarkStart w:id="43" w:name="X39ca26358e22f97022665c9c7b181532d078857"/>
     <w:p>
       <w:pPr>
         <w:pStyle w:val="Heading2"/>
@@ -5711,8 +5796,8 @@
         </w:tc>
       </w:tr>
     </w:tbl>
-    <w:bookmarkEnd w:id="38"/>
-    <w:bookmarkStart w:id="39" w:name="progression-design-notes"/>
+    <w:bookmarkEnd w:id="43"/>
+    <w:bookmarkStart w:id="44" w:name="progression-design-notes"/>
     <w:p>
       <w:pPr>
         <w:pStyle w:val="Heading2"/>
@@ -5816,9 +5901,9 @@
         </w:pict>
       </w:r>
     </w:p>
-    <w:bookmarkEnd w:id="39"/>
-    <w:bookmarkEnd w:id="40"/>
-    <w:bookmarkStart w:id="60" w:name="X7c4bedf91c9063eefbee52070a704bf6dd2951a"/>
+    <w:bookmarkEnd w:id="44"/>
+    <w:bookmarkEnd w:id="45"/>
+    <w:bookmarkStart w:id="65" w:name="X7c4bedf91c9063eefbee52070a704bf6dd2951a"/>
     <w:p>
       <w:pPr>
         <w:pStyle w:val="Heading1"/>
@@ -5835,7 +5920,7 @@
         <w:t xml:space="preserve">This section is not adjectives — it is a buildable spec. Each of the four pillars is grounded in an established, named design framework and turned into concrete decisions a developer can implement on day one.</w:t>
       </w:r>
     </w:p>
-    <w:bookmarkStart w:id="43" w:name="Xb7ce321b14a9590f8a9f525d2522ba193dda18b"/>
+    <w:bookmarkStart w:id="48" w:name="Xb7ce321b14a9590f8a9f525d2522ba193dda18b"/>
     <w:p>
       <w:pPr>
         <w:pStyle w:val="Heading2"/>
@@ -6095,7 +6180,7 @@
         </w:tc>
       </w:tr>
     </w:tbl>
-    <w:bookmarkStart w:id="41" w:name="Xeb5ab9c724079caf34baa5d86f500b4f5bc99dc"/>
+    <w:bookmarkStart w:id="46" w:name="Xeb5ab9c724079caf34baa5d86f500b4f5bc99dc"/>
     <w:p>
       <w:pPr>
         <w:pStyle w:val="Heading3"/>
@@ -6184,8 +6269,8 @@
         <w:t xml:space="preserve">Worlds 1–2 are unloseable tutorials; challenge is introduced only after the core loop is automatic.</w:t>
       </w:r>
     </w:p>
-    <w:bookmarkEnd w:id="41"/>
-    <w:bookmarkStart w:id="42" w:name="X5a9dd17693ab085a2af4cb3ca5c927d9c8644b4"/>
+    <w:bookmarkEnd w:id="46"/>
+    <w:bookmarkStart w:id="47" w:name="X5a9dd17693ab085a2af4cb3ca5c927d9c8644b4"/>
     <w:p>
       <w:pPr>
         <w:pStyle w:val="Heading3"/>
@@ -6327,9 +6412,9 @@
         <w:t xml:space="preserve">, never punishing — is the emotional signature of the game</w:t>
       </w:r>
     </w:p>
-    <w:bookmarkEnd w:id="42"/>
-    <w:bookmarkEnd w:id="43"/>
-    <w:bookmarkStart w:id="49" w:name="Xc8256448c45cfed33d920c7bb598b362e13660d"/>
+    <w:bookmarkEnd w:id="47"/>
+    <w:bookmarkEnd w:id="48"/>
+    <w:bookmarkStart w:id="54" w:name="Xc8256448c45cfed33d920c7bb598b362e13660d"/>
     <w:p>
       <w:pPr>
         <w:pStyle w:val="Heading2"/>
@@ -6350,7 +6435,7 @@
         <w:t xml:space="preserve">Fitts’s Law, Krug)</w:t>
       </w:r>
     </w:p>
-    <w:bookmarkStart w:id="44" w:name="X274dea17a452b5c56bbb2dbd8611c01b1971f03"/>
+    <w:bookmarkStart w:id="49" w:name="X274dea17a452b5c56bbb2dbd8611c01b1971f03"/>
     <w:p>
       <w:pPr>
         <w:pStyle w:val="Heading3"/>
@@ -6383,8 +6468,8 @@
         <w:t xml:space="preserve">new concept. We never stack two new mechanics in the same level. This is the core reason the game stays easy as it deepens.</w:t>
       </w:r>
     </w:p>
-    <w:bookmarkEnd w:id="44"/>
-    <w:bookmarkStart w:id="45" w:name="Xcc27b4e1012d228ba861e143d7b93f6c9a3bdd3"/>
+    <w:bookmarkEnd w:id="49"/>
+    <w:bookmarkStart w:id="50" w:name="Xcc27b4e1012d228ba861e143d7b93f6c9a3bdd3"/>
     <w:p>
       <w:pPr>
         <w:pStyle w:val="Heading3"/>
@@ -6501,8 +6586,8 @@
         <w:t xml:space="preserve">outcome teaches the spec lesson through consequence, not a tooltip.</w:t>
       </w:r>
     </w:p>
-    <w:bookmarkEnd w:id="45"/>
-    <w:bookmarkStart w:id="46" w:name="forgiveness-remove-anxiety"/>
+    <w:bookmarkEnd w:id="50"/>
+    <w:bookmarkStart w:id="51" w:name="forgiveness-remove-anxiety"/>
     <w:p>
       <w:pPr>
         <w:pStyle w:val="Heading3"/>
@@ -6551,8 +6636,8 @@
         <w:t xml:space="preserve">Auto-save after every loop; the player can never lose a worker they built.</w:t>
       </w:r>
     </w:p>
-    <w:bookmarkEnd w:id="46"/>
-    <w:bookmarkStart w:id="47" w:name="Xd1bfe2edb008c5331e9cbcfb613455daee0f683"/>
+    <w:bookmarkEnd w:id="51"/>
+    <w:bookmarkStart w:id="52" w:name="Xd1bfe2edb008c5331e9cbcfb613455daee0f683"/>
     <w:p>
       <w:pPr>
         <w:pStyle w:val="Heading3"/>
@@ -6633,8 +6718,8 @@
         <w:t xml:space="preserve">icons + one-word labels; if an element needs a paragraph to explain, it is redesigned.</w:t>
       </w:r>
     </w:p>
-    <w:bookmarkEnd w:id="47"/>
-    <w:bookmarkStart w:id="48" w:name="accessibility-built-in-not-bolted-on"/>
+    <w:bookmarkEnd w:id="52"/>
+    <w:bookmarkStart w:id="53" w:name="accessibility-built-in-not-bolted-on"/>
     <w:p>
       <w:pPr>
         <w:pStyle w:val="Heading3"/>
@@ -6691,9 +6776,9 @@
         <w:t xml:space="preserve">Reduced-motion toggle (disables screen-shake/heavy particles)</w:t>
       </w:r>
     </w:p>
-    <w:bookmarkEnd w:id="48"/>
-    <w:bookmarkEnd w:id="49"/>
-    <w:bookmarkStart w:id="53" w:name="X25472e1ddaa52157ab5c0c78b7a42fb42d6a1f4"/>
+    <w:bookmarkEnd w:id="53"/>
+    <w:bookmarkEnd w:id="54"/>
+    <w:bookmarkStart w:id="58" w:name="X25472e1ddaa52157ab5c0c78b7a42fb42d6a1f4"/>
     <w:p>
       <w:pPr>
         <w:pStyle w:val="Heading2"/>
@@ -6702,7 +6787,7 @@
         <w:t xml:space="preserve">Pillar 3 — INTERACTIVE (grounded in Direct Manipulation + Player Agency)</w:t>
       </w:r>
     </w:p>
-    <w:bookmarkStart w:id="50" w:name="direct-manipulation-not-menus"/>
+    <w:bookmarkStart w:id="55" w:name="direct-manipulation-not-menus"/>
     <w:p>
       <w:pPr>
         <w:pStyle w:val="Heading3"/>
@@ -6958,8 +7043,8 @@
         </w:tc>
       </w:tr>
     </w:tbl>
-    <w:bookmarkEnd w:id="50"/>
-    <w:bookmarkStart w:id="51" w:name="meaningful-choices-agency"/>
+    <w:bookmarkEnd w:id="55"/>
+    <w:bookmarkStart w:id="56" w:name="meaningful-choices-agency"/>
     <w:p>
       <w:pPr>
         <w:pStyle w:val="Heading3"/>
@@ -7024,8 +7109,8 @@
         <w:t xml:space="preserve">build to discover, not one forced answer.</w:t>
       </w:r>
     </w:p>
-    <w:bookmarkEnd w:id="51"/>
-    <w:bookmarkStart w:id="52" w:name="a-living-reactive-world"/>
+    <w:bookmarkEnd w:id="56"/>
+    <w:bookmarkStart w:id="57" w:name="a-living-reactive-world"/>
     <w:p>
       <w:pPr>
         <w:pStyle w:val="Heading3"/>
@@ -7071,9 +7156,9 @@
         <w:t xml:space="preserve">, not just a number).</w:t>
       </w:r>
     </w:p>
-    <w:bookmarkEnd w:id="52"/>
-    <w:bookmarkEnd w:id="53"/>
-    <w:bookmarkStart w:id="58" w:name="Xc58812c9b6e04d0b52454ab6c8fc3b48d9654a4"/>
+    <w:bookmarkEnd w:id="57"/>
+    <w:bookmarkEnd w:id="58"/>
+    <w:bookmarkStart w:id="63" w:name="Xc58812c9b6e04d0b52454ab6c8fc3b48d9654a4"/>
     <w:p>
       <w:pPr>
         <w:pStyle w:val="Heading2"/>
@@ -7090,7 +7175,7 @@
         <w:t xml:space="preserve">These are definitive choices, not options — chosen for charm, readability, and the ability to ship on web + mobile at 60fps.</w:t>
       </w:r>
     </w:p>
-    <w:bookmarkStart w:id="54" w:name="X27b17821ca57135b4b46d6641d3f6195678644f"/>
+    <w:bookmarkStart w:id="59" w:name="X27b17821ca57135b4b46d6641d3f6195678644f"/>
     <w:p>
       <w:pPr>
         <w:pStyle w:val="Heading3"/>
@@ -7171,8 +7256,8 @@
         <w:t xml:space="preserve">.</w:t>
       </w:r>
     </w:p>
-    <w:bookmarkEnd w:id="54"/>
-    <w:bookmarkStart w:id="55" w:name="X0d34bca6ea35b37d3ca93a9b27646d27b3b1ffe"/>
+    <w:bookmarkEnd w:id="59"/>
+    <w:bookmarkStart w:id="60" w:name="X0d34bca6ea35b37d3ca93a9b27646d27b3b1ffe"/>
     <w:p>
       <w:pPr>
         <w:pStyle w:val="Heading3"/>
@@ -7536,8 +7621,8 @@
         <w:t xml:space="preserve">error only.</w:t>
       </w:r>
     </w:p>
-    <w:bookmarkEnd w:id="55"/>
-    <w:bookmarkStart w:id="56" w:name="production-pipeline-real-off-the-shelf"/>
+    <w:bookmarkEnd w:id="60"/>
+    <w:bookmarkStart w:id="61" w:name="production-pipeline-real-off-the-shelf"/>
     <w:p>
       <w:pPr>
         <w:pStyle w:val="Heading3"/>
@@ -7668,8 +7753,8 @@
         <w:t xml:space="preserve">components; TextMeshPro for crisp text at every resolution.</w:t>
       </w:r>
     </w:p>
-    <w:bookmarkEnd w:id="56"/>
-    <w:bookmarkStart w:id="57" w:name="X5650c8e47fd92b0aa10367e37d3a16530c42ee0"/>
+    <w:bookmarkEnd w:id="61"/>
+    <w:bookmarkStart w:id="62" w:name="X5650c8e47fd92b0aa10367e37d3a16530c42ee0"/>
     <w:p>
       <w:pPr>
         <w:pStyle w:val="Heading3"/>
@@ -7750,9 +7835,9 @@
         <w:t xml:space="preserve">toggles for low-end devices</w:t>
       </w:r>
     </w:p>
-    <w:bookmarkEnd w:id="57"/>
-    <w:bookmarkEnd w:id="58"/>
-    <w:bookmarkStart w:id="59" w:name="X724bd373cb6b1ca0c0ea195cd34cf511020dae3"/>
+    <w:bookmarkEnd w:id="62"/>
+    <w:bookmarkEnd w:id="63"/>
+    <w:bookmarkStart w:id="64" w:name="X724bd373cb6b1ca0c0ea195cd34cf511020dae3"/>
     <w:p>
       <w:pPr>
         <w:pStyle w:val="Heading2"/>
@@ -8014,9 +8099,9 @@
         </w:pict>
       </w:r>
     </w:p>
-    <w:bookmarkEnd w:id="59"/>
-    <w:bookmarkEnd w:id="60"/>
-    <w:bookmarkStart w:id="69" w:name="X7db1bc12f3ab42dee6fa6a871ba582c114018fd"/>
+    <w:bookmarkEnd w:id="64"/>
+    <w:bookmarkEnd w:id="65"/>
+    <w:bookmarkStart w:id="74" w:name="X7db1bc12f3ab42dee6fa6a871ba582c114018fd"/>
     <w:p>
       <w:pPr>
         <w:pStyle w:val="Heading1"/>
@@ -8083,7 +8168,7 @@
         <w:t xml:space="preserve">This is the core mechanic screen, drawn as a 6-frame sequence. Each frame lists the visual, the juice/animation, the audio, Nova’s single line, and the concept it teaches.</w:t>
       </w:r>
     </w:p>
-    <w:bookmarkStart w:id="61" w:name="persistent-screen-layout-the-stage"/>
+    <w:bookmarkStart w:id="66" w:name="persistent-screen-layout-the-stage"/>
     <w:p>
       <w:pPr>
         <w:pStyle w:val="Heading2"/>
@@ -8337,8 +8422,8 @@
         <w:t xml:space="preserve">+------------------------------------+</w:t>
       </w:r>
     </w:p>
-    <w:bookmarkEnd w:id="61"/>
-    <w:bookmarkStart w:id="62" w:name="frame-1-the-bench-opens"/>
+    <w:bookmarkEnd w:id="66"/>
+    <w:bookmarkStart w:id="67" w:name="frame-1-the-bench-opens"/>
     <w:p>
       <w:pPr>
         <w:pStyle w:val="Heading2"/>
@@ -8510,8 +8595,8 @@
         <w:t xml:space="preserve">the active tray also shows an arrow plus label, not color alone.</w:t>
       </w:r>
     </w:p>
-    <w:bookmarkEnd w:id="62"/>
-    <w:bookmarkStart w:id="63" w:name="frame-2-dragging-the-brain-finger-down"/>
+    <w:bookmarkEnd w:id="67"/>
+    <w:bookmarkStart w:id="68" w:name="frame-2-dragging-the-brain-finger-down"/>
     <w:p>
       <w:pPr>
         <w:pStyle w:val="Heading2"/>
@@ -8691,8 +8776,8 @@
         <w:t xml:space="preserve">literal.</w:t>
       </w:r>
     </w:p>
-    <w:bookmarkEnd w:id="63"/>
-    <w:bookmarkStart w:id="64" w:name="frame-3-snap-brain-locks-in"/>
+    <w:bookmarkEnd w:id="68"/>
+    <w:bookmarkStart w:id="69" w:name="frame-3-snap-brain-locks-in"/>
     <w:p>
       <w:pPr>
         <w:pStyle w:val="Heading2"/>
@@ -8844,8 +8929,8 @@
         <w:t xml:space="preserve">placement leads to immediate, visible consequence. The worker visibly became smarter.</w:t>
       </w:r>
     </w:p>
-    <w:bookmarkEnd w:id="64"/>
-    <w:bookmarkStart w:id="65" w:name="frame-4-hands-attach"/>
+    <w:bookmarkEnd w:id="69"/>
+    <w:bookmarkStart w:id="70" w:name="frame-4-hands-attach"/>
     <w:p>
       <w:pPr>
         <w:pStyle w:val="Heading2"/>
@@ -8992,8 +9077,8 @@
         <w:t xml:space="preserve">that let the agent act on real systems.</w:t>
       </w:r>
     </w:p>
-    <w:bookmarkEnd w:id="65"/>
-    <w:bookmarkStart w:id="66" w:name="frame-5-training-book-absorbed"/>
+    <w:bookmarkEnd w:id="70"/>
+    <w:bookmarkStart w:id="71" w:name="frame-5-training-book-absorbed"/>
     <w:p>
       <w:pPr>
         <w:pStyle w:val="Heading2"/>
@@ -9153,8 +9238,8 @@
         <w:t xml:space="preserve">(domain knowledge plus SOPs).</w:t>
       </w:r>
     </w:p>
-    <w:bookmarkEnd w:id="66"/>
-    <w:bookmarkStart w:id="67" w:name="frame-6-the-shift-clock-worker-complete"/>
+    <w:bookmarkEnd w:id="71"/>
+    <w:bookmarkStart w:id="72" w:name="frame-6-the-shift-clock-worker-complete"/>
     <w:p>
       <w:pPr>
         <w:pStyle w:val="Heading2"/>
@@ -9354,8 +9439,8 @@
         <w:t xml:space="preserve">The worker is now a complete Digital FTE: Brain + Hands + Training + Shift.</w:t>
       </w:r>
     </w:p>
-    <w:bookmarkEnd w:id="67"/>
-    <w:bookmarkStart w:id="68" w:name="designer-notes-for-this-screen"/>
+    <w:bookmarkEnd w:id="72"/>
+    <w:bookmarkStart w:id="73" w:name="designer-notes-for-this-screen"/>
     <w:p>
       <w:pPr>
         <w:pStyle w:val="Heading2"/>
@@ -9515,9 +9600,9 @@
         </w:pict>
       </w:r>
     </w:p>
-    <w:bookmarkEnd w:id="68"/>
-    <w:bookmarkEnd w:id="69"/>
-    <w:bookmarkStart w:id="78" w:name="Xca6e2e7ec5efcc028b9d0f5edc777b07575014f"/>
+    <w:bookmarkEnd w:id="73"/>
+    <w:bookmarkEnd w:id="74"/>
+    <w:bookmarkStart w:id="83" w:name="Xca6e2e7ec5efcc028b9d0f5edc777b07575014f"/>
     <w:p>
       <w:pPr>
         <w:pStyle w:val="Heading1"/>
@@ -9612,7 +9697,7 @@
         <w:t xml:space="preserve">Same format as the Scene 2 storyboard: a 6-frame sequence, each beat noting visual, juice, audio, Nova’s line, and the concept.</w:t>
       </w:r>
     </w:p>
-    <w:bookmarkStart w:id="70" w:name="persistent-screen-layout-the-stage-1"/>
+    <w:bookmarkStart w:id="75" w:name="persistent-screen-layout-the-stage-1"/>
     <w:p>
       <w:pPr>
         <w:pStyle w:val="Heading2"/>
@@ -9902,8 +9987,8 @@
         <w:t xml:space="preserve">+------------------------------------+</w:t>
       </w:r>
     </w:p>
-    <w:bookmarkEnd w:id="70"/>
-    <w:bookmarkStart w:id="71" w:name="frame-1-the-card-slides-up"/>
+    <w:bookmarkEnd w:id="75"/>
+    <w:bookmarkStart w:id="76" w:name="frame-1-the-card-slides-up"/>
     <w:p>
       <w:pPr>
         <w:pStyle w:val="Heading2"/>
@@ -10075,8 +10160,8 @@
         <w:t xml:space="preserve">blanks are numbered 1-2-3 and labeled, not just color-glowing.</w:t>
       </w:r>
     </w:p>
-    <w:bookmarkEnd w:id="71"/>
-    <w:bookmarkStart w:id="72" w:name="frame-2-tapping-a-word-tile"/>
+    <w:bookmarkEnd w:id="76"/>
+    <w:bookmarkStart w:id="77" w:name="frame-2-tapping-a-word-tile"/>
     <w:p>
       <w:pPr>
         <w:pStyle w:val="Heading2"/>
@@ -10241,8 +10326,8 @@
         <w:t xml:space="preserve">specs are built piece by piece — and you can revise freely (no penalty for experimenting).</w:t>
       </w:r>
     </w:p>
-    <w:bookmarkEnd w:id="72"/>
-    <w:bookmarkStart w:id="73" w:name="frame-3-the-silly-spec-the-signature-gag"/>
+    <w:bookmarkEnd w:id="77"/>
+    <w:bookmarkStart w:id="78" w:name="frame-3-the-silly-spec-the-signature-gag"/>
     <w:p>
       <w:pPr>
         <w:pStyle w:val="Heading2"/>
@@ -10495,8 +10580,8 @@
         <w:t xml:space="preserve">The player feels why clarity matters instead of being told — this is the heart of Spec-Driven Development.</w:t>
       </w:r>
     </w:p>
-    <w:bookmarkEnd w:id="73"/>
-    <w:bookmarkStart w:id="74" w:name="frame-4-nova-coaches-the-retry"/>
+    <w:bookmarkEnd w:id="78"/>
+    <w:bookmarkStart w:id="79" w:name="frame-4-nova-coaches-the-retry"/>
     <w:p>
       <w:pPr>
         <w:pStyle w:val="Heading2"/>
@@ -10653,8 +10738,8 @@
         <w:t xml:space="preserve">action then trigger then outcome.</w:t>
       </w:r>
     </w:p>
-    <w:bookmarkEnd w:id="74"/>
-    <w:bookmarkStart w:id="75" w:name="frame-5-the-perfect-spec"/>
+    <w:bookmarkEnd w:id="79"/>
+    <w:bookmarkStart w:id="80" w:name="frame-5-the-perfect-spec"/>
     <w:p>
       <w:pPr>
         <w:pStyle w:val="Heading2"/>
@@ -10861,8 +10946,8 @@
         <w:t xml:space="preserve">— the validated, well-formed spec (action/trigger/outcome).</w:t>
       </w:r>
     </w:p>
-    <w:bookmarkEnd w:id="75"/>
-    <w:bookmarkStart w:id="76" w:name="frame-6-hand-off-to-go"/>
+    <w:bookmarkEnd w:id="80"/>
+    <w:bookmarkStart w:id="81" w:name="frame-6-hand-off-to-go"/>
     <w:p>
       <w:pPr>
         <w:pStyle w:val="Heading2"/>
@@ -11055,8 +11140,8 @@
         <w:t xml:space="preserve">the worker — intent set, ready to execute (the start of the 10-80-10 loop).</w:t>
       </w:r>
     </w:p>
-    <w:bookmarkEnd w:id="76"/>
-    <w:bookmarkStart w:id="77" w:name="designer-notes-for-this-screen-1"/>
+    <w:bookmarkEnd w:id="81"/>
+    <w:bookmarkStart w:id="82" w:name="designer-notes-for-this-screen-1"/>
     <w:p>
       <w:pPr>
         <w:pStyle w:val="Heading2"/>
@@ -11216,9 +11301,9 @@
         </w:pict>
       </w:r>
     </w:p>
-    <w:bookmarkEnd w:id="77"/>
-    <w:bookmarkEnd w:id="78"/>
-    <w:bookmarkStart w:id="94" w:name="Xe084002d91b3c76f8ba77a347d6cc61a41406b5"/>
+    <w:bookmarkEnd w:id="82"/>
+    <w:bookmarkEnd w:id="83"/>
+    <w:bookmarkStart w:id="99" w:name="Xe084002d91b3c76f8ba77a347d6cc61a41406b5"/>
     <w:p>
       <w:pPr>
         <w:pStyle w:val="Heading1"/>
@@ -11259,7 +11344,7 @@
         <w:t xml:space="preserve">— the human verifies. Same format as the earlier storyboards.</w:t>
       </w:r>
     </w:p>
-    <w:bookmarkStart w:id="85" w:name="X0716f7960a4282a13db3630827b829e3b2e5d98"/>
+    <w:bookmarkStart w:id="90" w:name="X0716f7960a4282a13db3630827b829e3b2e5d98"/>
     <w:p>
       <w:pPr>
         <w:pStyle w:val="Heading2"/>
@@ -11318,7 +11403,7 @@
         <w:t xml:space="preserve">an agent composes Brain + Hands + Training to deliver an outcome</w:t>
       </w:r>
     </w:p>
-    <w:bookmarkStart w:id="79" w:name="persistent-screen-layout-the-stage-2"/>
+    <w:bookmarkStart w:id="84" w:name="persistent-screen-layout-the-stage-2"/>
     <w:p>
       <w:pPr>
         <w:pStyle w:val="Heading3"/>
@@ -11518,8 +11603,8 @@
         <w:t xml:space="preserve">+------------------------------------+</w:t>
       </w:r>
     </w:p>
-    <w:bookmarkEnd w:id="79"/>
-    <w:bookmarkStart w:id="80" w:name="frame-1-press-go"/>
+    <w:bookmarkEnd w:id="84"/>
+    <w:bookmarkStart w:id="85" w:name="frame-1-press-go"/>
     <w:p>
       <w:pPr>
         <w:pStyle w:val="Heading3"/>
@@ -11677,8 +11762,8 @@
         <w:t xml:space="preserve">the human sets intent and presses go — the agent now takes over (start of the 80%).</w:t>
       </w:r>
     </w:p>
-    <w:bookmarkEnd w:id="80"/>
-    <w:bookmarkStart w:id="81" w:name="frame-2-the-worker-reads-brain-chat"/>
+    <w:bookmarkEnd w:id="85"/>
+    <w:bookmarkStart w:id="86" w:name="frame-2-the-worker-reads-brain-chat"/>
     <w:p>
       <w:pPr>
         <w:pStyle w:val="Heading3"/>
@@ -11853,8 +11938,8 @@
         <w:t xml:space="preserve">tool (Hands).</w:t>
       </w:r>
     </w:p>
-    <w:bookmarkEnd w:id="81"/>
-    <w:bookmarkStart w:id="82" w:name="frame-3-the-worker-acts-hands-training"/>
+    <w:bookmarkEnd w:id="86"/>
+    <w:bookmarkStart w:id="87" w:name="frame-3-the-worker-acts-hands-training"/>
     <w:p>
       <w:pPr>
         <w:pStyle w:val="Heading3"/>
@@ -12026,8 +12111,8 @@
         <w:t xml:space="preserve">supplies the rule. The Digital FTE composes its parts.</w:t>
       </w:r>
     </w:p>
-    <w:bookmarkEnd w:id="82"/>
-    <w:bookmarkStart w:id="83" w:name="frame-4-the-worker-composes-the-reply"/>
+    <w:bookmarkEnd w:id="87"/>
+    <w:bookmarkStart w:id="88" w:name="frame-4-the-worker-composes-the-reply"/>
     <w:p>
       <w:pPr>
         <w:pStyle w:val="Heading3"/>
@@ -12167,8 +12252,8 @@
         <w:t xml:space="preserve">the agent synthesizes everything it gathered into a single, grounded outcome.</w:t>
       </w:r>
     </w:p>
-    <w:bookmarkEnd w:id="83"/>
-    <w:bookmarkStart w:id="84" w:name="frame-5-reply-sent-hand-off-to-verify"/>
+    <w:bookmarkEnd w:id="88"/>
+    <w:bookmarkStart w:id="89" w:name="frame-5-reply-sent-hand-off-to-verify"/>
     <w:p>
       <w:pPr>
         <w:pStyle w:val="Heading3"/>
@@ -12302,9 +12387,9 @@
         <w:t xml:space="preserve">the agent finished the 80% — now control returns to the human for the final 10%.</w:t>
       </w:r>
     </w:p>
-    <w:bookmarkEnd w:id="84"/>
-    <w:bookmarkEnd w:id="85"/>
-    <w:bookmarkStart w:id="92" w:name="scene-5-verify-approve-or-improve"/>
+    <w:bookmarkEnd w:id="89"/>
+    <w:bookmarkEnd w:id="90"/>
+    <w:bookmarkStart w:id="97" w:name="scene-5-verify-approve-or-improve"/>
     <w:p>
       <w:pPr>
         <w:pStyle w:val="Heading2"/>
@@ -12363,7 +12448,7 @@
         <w:t xml:space="preserve">the 10-80-10 rule — humans verify outcomes</w:t>
       </w:r>
     </w:p>
-    <w:bookmarkStart w:id="86" w:name="persistent-screen-layout-the-stage-3"/>
+    <w:bookmarkStart w:id="91" w:name="persistent-screen-layout-the-stage-3"/>
     <w:p>
       <w:pPr>
         <w:pStyle w:val="Heading3"/>
@@ -12545,8 +12630,8 @@
         <w:t xml:space="preserve">+------------------------------------+</w:t>
       </w:r>
     </w:p>
-    <w:bookmarkEnd w:id="86"/>
-    <w:bookmarkStart w:id="87" w:name="frame-1-the-verify-panel-slides-up"/>
+    <w:bookmarkEnd w:id="91"/>
+    <w:bookmarkStart w:id="92" w:name="frame-1-the-verify-panel-slides-up"/>
     <w:p>
       <w:pPr>
         <w:pStyle w:val="Heading3"/>
@@ -12668,8 +12753,8 @@
         <w:t xml:space="preserve">verification is a deliberate, named step — not an afterthought.</w:t>
       </w:r>
     </w:p>
-    <w:bookmarkEnd w:id="87"/>
-    <w:bookmarkStart w:id="88" w:name="frame-2-nova-frames-the-golden-rule"/>
+    <w:bookmarkEnd w:id="92"/>
+    <w:bookmarkStart w:id="93" w:name="frame-2-nova-frames-the-golden-rule"/>
     <w:p>
       <w:pPr>
         <w:pStyle w:val="Heading3"/>
@@ -12770,8 +12855,8 @@
         <w:t xml:space="preserve">— the core operating loop of working with Digital FTEs.</w:t>
       </w:r>
     </w:p>
-    <w:bookmarkEnd w:id="88"/>
-    <w:bookmarkStart w:id="89" w:name="frame-3-the-improve-branch-optional"/>
+    <w:bookmarkEnd w:id="93"/>
+    <w:bookmarkStart w:id="94" w:name="frame-3-the-improve-branch-optional"/>
     <w:p>
       <w:pPr>
         <w:pStyle w:val="Heading3"/>
@@ -12915,8 +13000,8 @@
         <w:t xml:space="preserve">, not just yes/no — the human refines the outcome.</w:t>
       </w:r>
     </w:p>
-    <w:bookmarkEnd w:id="89"/>
-    <w:bookmarkStart w:id="90" w:name="frame-4-the-approve-branch"/>
+    <w:bookmarkEnd w:id="94"/>
+    <w:bookmarkStart w:id="95" w:name="frame-4-the-approve-branch"/>
     <w:p>
       <w:pPr>
         <w:pStyle w:val="Heading3"/>
@@ -13083,8 +13168,8 @@
         <w:t xml:space="preserve">a verified, approved outcome closes the loop — value delivered.</w:t>
       </w:r>
     </w:p>
-    <w:bookmarkEnd w:id="90"/>
-    <w:bookmarkStart w:id="91" w:name="frame-5-hand-off-to-rewards"/>
+    <w:bookmarkEnd w:id="95"/>
+    <w:bookmarkStart w:id="96" w:name="frame-5-hand-off-to-rewards"/>
     <w:p>
       <w:pPr>
         <w:pStyle w:val="Heading3"/>
@@ -13175,9 +13260,9 @@
         <w:t xml:space="preserve">one full loop complete (intent -&gt; execute -&gt; verify -&gt; reward); the worker now runs on its own.</w:t>
       </w:r>
     </w:p>
-    <w:bookmarkEnd w:id="91"/>
-    <w:bookmarkEnd w:id="92"/>
-    <w:bookmarkStart w:id="93" w:name="designer-notes-for-these-two-screens"/>
+    <w:bookmarkEnd w:id="96"/>
+    <w:bookmarkEnd w:id="97"/>
+    <w:bookmarkStart w:id="98" w:name="designer-notes-for-these-two-screens"/>
     <w:p>
       <w:pPr>
         <w:pStyle w:val="Heading2"/>
@@ -13303,9 +13388,9 @@
         </w:pict>
       </w:r>
     </w:p>
-    <w:bookmarkEnd w:id="93"/>
-    <w:bookmarkEnd w:id="94"/>
-    <w:bookmarkStart w:id="108" w:name="X2b3f906e1c1b604f8d78c3be037ab581f120947"/>
+    <w:bookmarkEnd w:id="98"/>
+    <w:bookmarkEnd w:id="99"/>
+    <w:bookmarkStart w:id="113" w:name="X2b3f906e1c1b604f8d78c3be037ab581f120947"/>
     <w:p>
       <w:pPr>
         <w:pStyle w:val="Heading1"/>
@@ -13322,7 +13407,7 @@
         <w:t xml:space="preserve">These two scenes close out Level 1. Scene 6 is the celebration and progression payoff (coins, XP, the Night Shift unlock). Scene 7 is the optional bridge that connects the play to the real AgentFactory curriculum. Same format as the earlier storyboards.</w:t>
       </w:r>
     </w:p>
-    <w:bookmarkStart w:id="100" w:name="scene-6-rewards-and-the-idle-hook"/>
+    <w:bookmarkStart w:id="105" w:name="scene-6-rewards-and-the-idle-hook"/>
     <w:p>
       <w:pPr>
         <w:pStyle w:val="Heading2"/>
@@ -13381,7 +13466,7 @@
         <w:t xml:space="preserve">autonomous workers create value continuously (the Digital FTE promise)</w:t>
       </w:r>
     </w:p>
-    <w:bookmarkStart w:id="95" w:name="persistent-screen-layout-the-stage-4"/>
+    <w:bookmarkStart w:id="100" w:name="persistent-screen-layout-the-stage-4"/>
     <w:p>
       <w:pPr>
         <w:pStyle w:val="Heading3"/>
@@ -13617,8 +13702,8 @@
         <w:t xml:space="preserve">+------------------------------------+</w:t>
       </w:r>
     </w:p>
-    <w:bookmarkEnd w:id="95"/>
-    <w:bookmarkStart w:id="96" w:name="frame-1-the-victory-banner"/>
+    <w:bookmarkEnd w:id="100"/>
+    <w:bookmarkStart w:id="101" w:name="frame-1-the-victory-banner"/>
     <w:p>
       <w:pPr>
         <w:pStyle w:val="Heading3"/>
@@ -13743,8 +13828,8 @@
         <w:t xml:space="preserve">completion and triumph (Hard Fun payoff) — the player earned this.</w:t>
       </w:r>
     </w:p>
-    <w:bookmarkEnd w:id="96"/>
-    <w:bookmarkStart w:id="97" w:name="frame-2-coins-and-xp-tally"/>
+    <w:bookmarkEnd w:id="101"/>
+    <w:bookmarkStart w:id="102" w:name="frame-2-coins-and-xp-tally"/>
     <w:p>
       <w:pPr>
         <w:pStyle w:val="Heading3"/>
@@ -13881,8 +13966,8 @@
         <w:t xml:space="preserve">visible progression — clear evidence of growth keeps players motivated (drip-fed mastery).</w:t>
       </w:r>
     </w:p>
-    <w:bookmarkEnd w:id="97"/>
-    <w:bookmarkStart w:id="98" w:name="frame-3-the-night-shift-unlock"/>
+    <w:bookmarkEnd w:id="102"/>
+    <w:bookmarkStart w:id="103" w:name="frame-3-the-night-shift-unlock"/>
     <w:p>
       <w:pPr>
         <w:pStyle w:val="Heading3"/>
@@ -14090,8 +14175,8 @@
         <w:t xml:space="preserve">the Digital FTE promise (and the retention mechanic).</w:t>
       </w:r>
     </w:p>
-    <w:bookmarkEnd w:id="98"/>
-    <w:bookmarkStart w:id="99" w:name="frame-4-hand-off"/>
+    <w:bookmarkEnd w:id="103"/>
+    <w:bookmarkStart w:id="104" w:name="frame-4-hand-off"/>
     <w:p>
       <w:pPr>
         <w:pStyle w:val="Heading3"/>
@@ -14225,9 +14310,9 @@
         <w:t xml:space="preserve">momentum into the next loop — the core gameplay rhythm repeats and scales.</w:t>
       </w:r>
     </w:p>
-    <w:bookmarkEnd w:id="99"/>
-    <w:bookmarkEnd w:id="100"/>
-    <w:bookmarkStart w:id="106" w:name="X34a453d282532a2f8fbf463196937269bd7ac13"/>
+    <w:bookmarkEnd w:id="104"/>
+    <w:bookmarkEnd w:id="105"/>
+    <w:bookmarkStart w:id="111" w:name="X34a453d282532a2f8fbf463196937269bd7ac13"/>
     <w:p>
       <w:pPr>
         <w:pStyle w:val="Heading2"/>
@@ -14298,7 +14383,7 @@
         <w:t xml:space="preserve">what the player just did has a real name and a real course</w:t>
       </w:r>
     </w:p>
-    <w:bookmarkStart w:id="101" w:name="persistent-screen-layout-the-stage-5"/>
+    <w:bookmarkStart w:id="106" w:name="persistent-screen-layout-the-stage-5"/>
     <w:p>
       <w:pPr>
         <w:pStyle w:val="Heading3"/>
@@ -14489,8 +14574,8 @@
         <w:t xml:space="preserve">+------------------------------------+</w:t>
       </w:r>
     </w:p>
-    <w:bookmarkEnd w:id="101"/>
-    <w:bookmarkStart w:id="102" w:name="frame-1-the-card-gently-appears"/>
+    <w:bookmarkEnd w:id="106"/>
+    <w:bookmarkStart w:id="107" w:name="frame-1-the-card-gently-appears"/>
     <w:p>
       <w:pPr>
         <w:pStyle w:val="Heading3"/>
@@ -14615,8 +14700,8 @@
         <w:t xml:space="preserve">the game is a doorway, not a wall - the bridge is optional and low-pressure.</w:t>
       </w:r>
     </w:p>
-    <w:bookmarkEnd w:id="102"/>
-    <w:bookmarkStart w:id="103" w:name="frame-2-the-connection-is-made"/>
+    <w:bookmarkEnd w:id="107"/>
+    <w:bookmarkStart w:id="108" w:name="frame-2-the-connection-is-made"/>
     <w:p>
       <w:pPr>
         <w:pStyle w:val="Heading3"/>
@@ -14760,8 +14845,8 @@
         <w:t xml:space="preserve">- the play has real-world meaning and a concrete next step in the actual curriculum.</w:t>
       </w:r>
     </w:p>
-    <w:bookmarkEnd w:id="103"/>
-    <w:bookmarkStart w:id="104" w:name="frame-3-the-two-choices"/>
+    <w:bookmarkEnd w:id="108"/>
+    <w:bookmarkStart w:id="109" w:name="frame-3-the-two-choices"/>
     <w:p>
       <w:pPr>
         <w:pStyle w:val="Heading3"/>
@@ -14916,8 +15001,8 @@
         <w:t xml:space="preserve">respectful, opt-in learning funnel - turns enjoyment into genuine curiosity about AgentFactory’s real courses.</w:t>
       </w:r>
     </w:p>
-    <w:bookmarkEnd w:id="104"/>
-    <w:bookmarkStart w:id="105" w:name="frame-4-return-to-play"/>
+    <w:bookmarkEnd w:id="109"/>
+    <w:bookmarkStart w:id="110" w:name="frame-4-return-to-play"/>
     <w:p>
       <w:pPr>
         <w:pStyle w:val="Heading3"/>
@@ -14999,9 +15084,9 @@
         <w:t xml:space="preserve">the loop continues - fun first, real learning always one tap away.</w:t>
       </w:r>
     </w:p>
-    <w:bookmarkEnd w:id="105"/>
-    <w:bookmarkEnd w:id="106"/>
-    <w:bookmarkStart w:id="107" w:name="designer-notes-for-these-two-screens-1"/>
+    <w:bookmarkEnd w:id="110"/>
+    <w:bookmarkEnd w:id="111"/>
+    <w:bookmarkStart w:id="112" w:name="designer-notes-for-these-two-screens-1"/>
     <w:p>
       <w:pPr>
         <w:pStyle w:val="Heading2"/>
@@ -15173,9 +15258,9 @@
         </w:pict>
       </w:r>
     </w:p>
-    <w:bookmarkEnd w:id="107"/>
-    <w:bookmarkEnd w:id="108"/>
-    <w:bookmarkStart w:id="117" w:name="part-9-character-bio-nova-your-guide"/>
+    <w:bookmarkEnd w:id="112"/>
+    <w:bookmarkEnd w:id="113"/>
+    <w:bookmarkStart w:id="122" w:name="part-9-character-bio-nova-your-guide"/>
     <w:p>
       <w:pPr>
         <w:pStyle w:val="Heading1"/>
@@ -15192,7 +15277,7 @@
         <w:t xml:space="preserve">This section fully specifies Nova so an art, animation, and writing team can build her consistently. Nova is the player’s companion and tutor across every scene; her job is to make a complex subject (Agentic AI) feel warm, easy, and fun.</w:t>
       </w:r>
     </w:p>
-    <w:bookmarkStart w:id="109" w:name="at-a-glance"/>
+    <w:bookmarkStart w:id="114" w:name="at-a-glance"/>
     <w:p>
       <w:pPr>
         <w:pStyle w:val="Heading2"/>
@@ -15417,8 +15502,8 @@
         </w:tc>
       </w:tr>
     </w:tbl>
-    <w:bookmarkEnd w:id="109"/>
-    <w:bookmarkStart w:id="110" w:name="visual-design"/>
+    <w:bookmarkEnd w:id="114"/>
+    <w:bookmarkStart w:id="115" w:name="visual-design"/>
     <w:p>
       <w:pPr>
         <w:pStyle w:val="Heading2"/>
@@ -15583,8 +15668,8 @@
         <w:t xml:space="preserve">instantly recognizable as a glowing dot with eyes and a spark tail — clean at any resolution (matches the low-poly art direction).</w:t>
       </w:r>
     </w:p>
-    <w:bookmarkEnd w:id="110"/>
-    <w:bookmarkStart w:id="111" w:name="personality"/>
+    <w:bookmarkEnd w:id="115"/>
+    <w:bookmarkStart w:id="116" w:name="personality"/>
     <w:p>
       <w:pPr>
         <w:pStyle w:val="Heading2"/>
@@ -15769,8 +15854,8 @@
         <w:t xml:space="preserve">reinforcing that the player is the boss.</w:t>
       </w:r>
     </w:p>
-    <w:bookmarkEnd w:id="111"/>
-    <w:bookmarkStart w:id="112" w:name="voice-tone-rules-for-writers"/>
+    <w:bookmarkEnd w:id="116"/>
+    <w:bookmarkStart w:id="117" w:name="voice-tone-rules-for-writers"/>
     <w:p>
       <w:pPr>
         <w:pStyle w:val="Heading2"/>
@@ -15969,8 +16054,8 @@
         <w:t xml:space="preserve">Nova only nudges with the answer after a player struggles — capable players keep the challenge.</w:t>
       </w:r>
     </w:p>
-    <w:bookmarkEnd w:id="112"/>
-    <w:bookmarkStart w:id="113" w:name="sample-catchphrases"/>
+    <w:bookmarkEnd w:id="117"/>
+    <w:bookmarkStart w:id="118" w:name="sample-catchphrases"/>
     <w:p>
       <w:pPr>
         <w:pStyle w:val="Heading2"/>
@@ -16135,8 +16220,8 @@
         <w:t xml:space="preserve">“On to the next hire!”</w:t>
       </w:r>
     </w:p>
-    <w:bookmarkEnd w:id="113"/>
-    <w:bookmarkStart w:id="114" w:name="animation-set-for-the-animator"/>
+    <w:bookmarkEnd w:id="118"/>
+    <w:bookmarkStart w:id="119" w:name="animation-set-for-the-animator"/>
     <w:p>
       <w:pPr>
         <w:pStyle w:val="Heading2"/>
@@ -16364,8 +16449,8 @@
         </w:tc>
       </w:tr>
     </w:tbl>
-    <w:bookmarkEnd w:id="114"/>
-    <w:bookmarkStart w:id="115" w:name="accessibility-for-nova"/>
+    <w:bookmarkEnd w:id="119"/>
+    <w:bookmarkStart w:id="120" w:name="accessibility-for-nova"/>
     <w:p>
       <w:pPr>
         <w:pStyle w:val="Heading2"/>
@@ -16484,8 +16569,8 @@
         <w:t xml:space="preserve">caption text uses the UI’s adjustable size and high-contrast settings.</w:t>
       </w:r>
     </w:p>
-    <w:bookmarkEnd w:id="115"/>
-    <w:bookmarkStart w:id="116" w:name="why-nova-works"/>
+    <w:bookmarkEnd w:id="120"/>
+    <w:bookmarkStart w:id="121" w:name="why-nova-works"/>
     <w:p>
       <w:pPr>
         <w:pStyle w:val="Heading2"/>
@@ -16557,9 +16642,9 @@
         </w:pict>
       </w:r>
     </w:p>
-    <w:bookmarkEnd w:id="116"/>
-    <w:bookmarkEnd w:id="117"/>
-    <w:bookmarkStart w:id="126" w:name="part-10-the-2-week-mvp-build-plan"/>
+    <w:bookmarkEnd w:id="121"/>
+    <w:bookmarkEnd w:id="122"/>
+    <w:bookmarkStart w:id="131" w:name="part-10-the-2-week-mvp-build-plan"/>
     <w:p>
       <w:pPr>
         <w:pStyle w:val="Heading1"/>
@@ -16605,7 +16690,7 @@
         <w:t xml:space="preserve">: assemble a worker, write a spec, press GO, verify, get rewarded. If playtesters smile at that loop, the concept is validated.</w:t>
       </w:r>
     </w:p>
-    <w:bookmarkStart w:id="118" w:name="scope-what-the-mvp-includes-and-excludes"/>
+    <w:bookmarkStart w:id="123" w:name="scope-what-the-mvp-includes-and-excludes"/>
     <w:p>
       <w:pPr>
         <w:pStyle w:val="Heading2"/>
@@ -16803,8 +16888,8 @@
         <w:t xml:space="preserve">Cloud save (local save only)</w:t>
       </w:r>
     </w:p>
-    <w:bookmarkEnd w:id="118"/>
-    <w:bookmarkStart w:id="119" w:name="team-assumption"/>
+    <w:bookmarkEnd w:id="123"/>
+    <w:bookmarkStart w:id="124" w:name="team-assumption"/>
     <w:p>
       <w:pPr>
         <w:pStyle w:val="Heading2"/>
@@ -16833,8 +16918,8 @@
         <w:t xml:space="preserve">as sequential.</w:t>
       </w:r>
     </w:p>
-    <w:bookmarkEnd w:id="119"/>
-    <w:bookmarkStart w:id="120" w:name="technical-setup-day-0-pre-flight"/>
+    <w:bookmarkEnd w:id="124"/>
+    <w:bookmarkStart w:id="125" w:name="technical-setup-day-0-pre-flight"/>
     <w:p>
       <w:pPr>
         <w:pStyle w:val="Heading2"/>
@@ -16903,8 +16988,8 @@
         <w:t xml:space="preserve">A grey-box art kit (Kenney/Synty placeholders) so engineering never waits on final art</w:t>
       </w:r>
     </w:p>
-    <w:bookmarkEnd w:id="120"/>
-    <w:bookmarkStart w:id="121" w:name="X7097aabe06ec4e6af17342a76e3b96ebd82aed0"/>
+    <w:bookmarkEnd w:id="125"/>
+    <w:bookmarkStart w:id="126" w:name="X7097aabe06ec4e6af17342a76e3b96ebd82aed0"/>
     <w:p>
       <w:pPr>
         <w:pStyle w:val="Heading2"/>
@@ -17193,8 +17278,8 @@
         <w:t xml:space="preserve">a player can build a worker and write a valid spec, with satisfying feedback. Internal smoke-test the build → spec flow.</w:t>
       </w:r>
     </w:p>
-    <w:bookmarkEnd w:id="121"/>
-    <w:bookmarkStart w:id="122" w:name="week-2-close-the-loop-polish-playtest"/>
+    <w:bookmarkEnd w:id="126"/>
+    <w:bookmarkStart w:id="127" w:name="week-2-close-the-loop-polish-playtest"/>
     <w:p>
       <w:pPr>
         <w:pStyle w:val="Heading2"/>
@@ -17587,8 +17672,8 @@
         <w:t xml:space="preserve">a polished, playable Level 1 vertical slice with real art, audio, and instrumentation — ready to demo and to greenlight (or not) full production.</w:t>
       </w:r>
     </w:p>
-    <w:bookmarkEnd w:id="122"/>
-    <w:bookmarkStart w:id="123" w:name="definition-of-done-mvp"/>
+    <w:bookmarkEnd w:id="127"/>
+    <w:bookmarkStart w:id="128" w:name="definition-of-done-mvp"/>
     <w:p>
       <w:pPr>
         <w:pStyle w:val="Heading2"/>
@@ -17657,8 +17742,8 @@
         <w:t xml:space="preserve">Analytics capture loop-completion and drop-off</w:t>
       </w:r>
     </w:p>
-    <w:bookmarkEnd w:id="123"/>
-    <w:bookmarkStart w:id="124" w:name="success-metrics-the-validation-bar"/>
+    <w:bookmarkEnd w:id="128"/>
+    <w:bookmarkStart w:id="129" w:name="success-metrics-the-validation-bar"/>
     <w:p>
       <w:pPr>
         <w:pStyle w:val="Heading2"/>
@@ -17907,8 +17992,8 @@
         <w:t xml:space="preserve">If these targets are met, the assemble → spec → verify loop is proven and the project is ready to scale to the full 26-level game. If not, the report pinpoints exactly which pillar needs rework before further investment.</w:t>
       </w:r>
     </w:p>
-    <w:bookmarkEnd w:id="124"/>
-    <w:bookmarkStart w:id="125" w:name="key-risks-and-mitigations"/>
+    <w:bookmarkEnd w:id="129"/>
+    <w:bookmarkStart w:id="130" w:name="key-risks-and-mitigations"/>
     <w:p>
       <w:pPr>
         <w:pStyle w:val="Heading2"/>
@@ -18024,9 +18109,9 @@
         </w:pict>
       </w:r>
     </w:p>
-    <w:bookmarkEnd w:id="125"/>
-    <w:bookmarkEnd w:id="126"/>
-    <w:bookmarkStart w:id="131" w:name="part-11-github-sync-deployment"/>
+    <w:bookmarkEnd w:id="130"/>
+    <w:bookmarkEnd w:id="131"/>
+    <w:bookmarkStart w:id="136" w:name="part-11-github-sync-deployment"/>
     <w:p>
       <w:pPr>
         <w:pStyle w:val="Heading1"/>
@@ -18043,7 +18128,7 @@
         <w:t xml:space="preserve">The playable prototype and this design document are version-controlled on GitHub and published as a live, in-browser game via GitHub Pages.</w:t>
       </w:r>
     </w:p>
-    <w:bookmarkStart w:id="127" w:name="live-links"/>
+    <w:bookmarkStart w:id="132" w:name="live-links"/>
     <w:p>
       <w:pPr>
         <w:pStyle w:val="Heading2"/>
@@ -18204,8 +18289,8 @@
         <w:t xml:space="preserve">.</w:t>
       </w:r>
     </w:p>
-    <w:bookmarkEnd w:id="127"/>
-    <w:bookmarkStart w:id="128" w:name="one-time-setup-how-it-was-synced"/>
+    <w:bookmarkEnd w:id="132"/>
+    <w:bookmarkStart w:id="133" w:name="one-time-setup-how-it-was-synced"/>
     <w:p>
       <w:pPr>
         <w:pStyle w:val="Heading2"/>
@@ -18635,8 +18720,8 @@
         <w:t xml:space="preserve"> .status</w:t>
       </w:r>
     </w:p>
-    <w:bookmarkEnd w:id="128"/>
-    <w:bookmarkStart w:id="129" w:name="update-workflow-for-every-future-change"/>
+    <w:bookmarkEnd w:id="133"/>
+    <w:bookmarkStart w:id="134" w:name="update-workflow-for-every-future-change"/>
     <w:p>
       <w:pPr>
         <w:pStyle w:val="Heading2"/>
@@ -18756,8 +18841,8 @@
         <w:t xml:space="preserve">) to bypass the browser cache and see the update.</w:t>
       </w:r>
     </w:p>
-    <w:bookmarkEnd w:id="129"/>
-    <w:bookmarkStart w:id="130" w:name="regenerating-the-documents"/>
+    <w:bookmarkEnd w:id="134"/>
+    <w:bookmarkStart w:id="135" w:name="regenerating-the-documents"/>
     <w:p>
       <w:pPr>
         <w:pStyle w:val="Heading2"/>
@@ -18811,9 +18896,9 @@
         </w:pict>
       </w:r>
     </w:p>
-    <w:bookmarkEnd w:id="130"/>
-    <w:bookmarkEnd w:id="131"/>
-    <w:bookmarkStart w:id="138" w:name="sources"/>
+    <w:bookmarkEnd w:id="135"/>
+    <w:bookmarkEnd w:id="136"/>
+    <w:bookmarkStart w:id="143" w:name="sources"/>
     <w:p>
       <w:pPr>
         <w:pStyle w:val="Heading1"/>
@@ -18836,7 +18921,7 @@
       <w:r>
         <w:t xml:space="preserve"> </w:t>
       </w:r>
-      <w:hyperlink r:id="rId132">
+      <w:hyperlink r:id="rId137">
         <w:r>
           <w:rPr>
             <w:rStyle w:val="Hyperlink"/>
@@ -18859,7 +18944,7 @@
       <w:r>
         <w:t xml:space="preserve"> </w:t>
       </w:r>
-      <w:hyperlink r:id="rId133">
+      <w:hyperlink r:id="rId138">
         <w:r>
           <w:rPr>
             <w:rStyle w:val="Hyperlink"/>
@@ -18882,7 +18967,7 @@
       <w:r>
         <w:t xml:space="preserve"> </w:t>
       </w:r>
-      <w:hyperlink r:id="rId134">
+      <w:hyperlink r:id="rId139">
         <w:r>
           <w:rPr>
             <w:rStyle w:val="Hyperlink"/>
@@ -18905,7 +18990,7 @@
       <w:r>
         <w:t xml:space="preserve"> </w:t>
       </w:r>
-      <w:hyperlink r:id="rId135">
+      <w:hyperlink r:id="rId140">
         <w:r>
           <w:rPr>
             <w:rStyle w:val="Hyperlink"/>
@@ -18928,7 +19013,7 @@
       <w:r>
         <w:t xml:space="preserve"> </w:t>
       </w:r>
-      <w:hyperlink r:id="rId136">
+      <w:hyperlink r:id="rId141">
         <w:r>
           <w:rPr>
             <w:rStyle w:val="Hyperlink"/>
@@ -18951,7 +19036,7 @@
       <w:r>
         <w:t xml:space="preserve"> </w:t>
       </w:r>
-      <w:hyperlink r:id="rId137">
+      <w:hyperlink r:id="rId142">
         <w:r>
           <w:rPr>
             <w:rStyle w:val="Hyperlink"/>
@@ -18960,7 +19045,7 @@
         </w:r>
       </w:hyperlink>
     </w:p>
-    <w:bookmarkEnd w:id="138"/>
+    <w:bookmarkEnd w:id="143"/>
     <w:sectPr>
       <w:footnotePr>
         <w:numRestart w:val="eachSect"/>

</xml_diff>

<commit_message>
Swap SVG badge for a local PNG so it embeds in docx/pdf
Add generated play_badge.png (and make_badge.py generator); use it in
the README and concept doc. Regenerate docx and pdf with the embedded badge.

Co-Authored-By: Claude Opus 4.8 <noreply@anthropic.com>
</commit_message>
<xml_diff>
--- a/Agent_Factory_Tycoon_Concept.docx
+++ b/Agent_Factory_Tycoon_Concept.docx
@@ -127,29 +127,20 @@
         <w:r>
           <w:drawing>
             <wp:inline>
-              <wp:extent cx="2466975" cy="266700"/>
+              <wp:extent cx="4013200" cy="406400"/>
               <wp:effectExtent b="0" l="0" r="0" t="0"/>
               <wp:docPr descr="Play Agent Factory Tycoon" title="" id="11" name="Picture"/>
               <a:graphic>
                 <a:graphicData uri="http://schemas.openxmlformats.org/drawingml/2006/picture">
                   <pic:pic>
                     <pic:nvPicPr>
-                      <pic:cNvPr descr="https://img.shields.io/badge/▶%20Play-Agent%20Factory%20Tycoon-6D28D9?style=for-the-badge" id="12" name="Picture"/>
+                      <pic:cNvPr descr="play_badge.png" id="12" name="Picture"/>
                       <pic:cNvPicPr>
                         <a:picLocks noChangeArrowheads="1" noChangeAspect="1"/>
                       </pic:cNvPicPr>
                     </pic:nvPicPr>
                     <pic:blipFill>
-                      <a:blip>
-                        <a:extLst>
-                          <a:ext uri="{28A0092B-C50C-407E-A947-70E740481C1C}">
-                            <a14:useLocalDpi xmlns:a14="http://schemas.microsoft.com/office/drawing/2010/main" val="0"/>
-                          </a:ext>
-                          <a:ext uri="{96DAC541-7B7A-43D3-8B79-37D633B846F1}">
-                            <asvg:svgBlip xmlns:asvg="http://schemas.microsoft.com/office/drawing/2016/SVG/main" r:embed="rId10"/>
-                          </a:ext>
-                        </a:extLst>
-                      </a:blip>
+                      <a:blip r:embed="rId10"/>
                       <a:stretch>
                         <a:fillRect/>
                       </a:stretch>
@@ -157,7 +148,7 @@
                     <pic:spPr bwMode="auto">
                       <a:xfrm>
                         <a:off x="0" y="0"/>
-                        <a:ext cx="2466975" cy="266700"/>
+                        <a:ext cx="4013200" cy="406400"/>
                       </a:xfrm>
                       <a:prstGeom prst="rect">
                         <a:avLst/>

</xml_diff>

<commit_message>
Make the play badge a rounded pill shape
Regenerate play_badge.png (full pill rounding, transparent corners)
and rebuild docx and pdf.

Co-Authored-By: Claude Opus 4.8 <noreply@anthropic.com>
</commit_message>
<xml_diff>
--- a/Agent_Factory_Tycoon_Concept.docx
+++ b/Agent_Factory_Tycoon_Concept.docx
@@ -127,7 +127,7 @@
         <w:r>
           <w:drawing>
             <wp:inline>
-              <wp:extent cx="4013200" cy="406400"/>
+              <wp:extent cx="4279900" cy="431800"/>
               <wp:effectExtent b="0" l="0" r="0" t="0"/>
               <wp:docPr descr="Play Agent Factory Tycoon" title="" id="11" name="Picture"/>
               <a:graphic>
@@ -148,7 +148,7 @@
                     <pic:spPr bwMode="auto">
                       <a:xfrm>
                         <a:off x="0" y="0"/>
-                        <a:ext cx="4013200" cy="406400"/>
+                        <a:ext cx="4279900" cy="431800"/>
                       </a:xfrm>
                       <a:prstGeom prst="rect">
                         <a:avLst/>

</xml_diff>